<commit_message>
Docs, sheet and patch copies for the Dowry (1961) and Juvenile Justice (2015) Acts on the shelf (FOLLOW_UPS 2av, DEPLOY_STAGING Part 4p)
Both Acts loaded, machine-checked and embedded in Recourse (5616546, 1ce4de4; branch only;
ACT_SHELF default off). Nine Acts on the shelf.

- FOLLOW_UPS 2av, DEPLOY_STAGING Part 4p, CLAUDE.md bullet, STATUTE_COVERAGE_PLAN status, acts/README
- acts/build_shelf_sheet.py and ACT_SHELF_SHEET.docx rebuilt for nine Acts (Dowry 10 sections, JJ
  13; the JJ "Child Welfare Officer" correction and the apostrophe corrections printed under its
  table; the Dowry 8A toc_absent and Haryana tails explained)
- site_patch copies refreshed (build_act_chunks.py with the toc_absent field, eval_act_shelf.py,
  the two test files, manifest, LOAD_REPORT, EVAL_NOTES, the frozen gold questions/probes and
  EVAL_RESULTS_JJDOWRY)

Co-Authored-By: Claude Opus 4.8 <noreply@anthropic.com>
Claude-Session: https://claude.ai/code/session_01YEUNXbYb9LDbJLc2ziqL3n
</commit_message>
<xml_diff>
--- a/acts/ACT_SHELF_SHEET.docx
+++ b/acts/ACT_SHELF_SHEET.docx
@@ -18,7 +18,7 @@
         <w:t xml:space="preserve">What this is. </w:t>
       </w:r>
       <w:r>
-        <w:t xml:space="preserve">Recourse can now keep the full text of an Act that is not in its BNS/BNSS library, and hand the sections that bear on a question to the answer model, when the question names that Act (for example "section 45 of the PMLA", "POCSO", "SC/ST Act"). Seven Acts are loaded: the Prevention of Corruption Act, 1988; POCSO, 2012; the UAPA, 1967; the PMLA, 2002; the SC/ST (Prevention of Atrocities) Act, 1989; the Muslim Women (Protection of Rights on Marriage) Act, 2019; and the Prevention of Damage to Public Property Act, 1984. The last two are short (eight and seven sections, about 3,300 and 3,800 characters), so when a question names one of them Recourse hands the answer model the whole Act, not the sections closest to the question; this sheet therefore shows every section of those two. The text comes from India Code's own database. A program then compared it with India Code's PDF of the same Act: the arrangement of sections is identical, and every section was read against the PDF's own text word by word, in order, in both directions (so a doubled word, a lost apostrophe or a whole lost proviso is found, not only an unknown word). It found, and the loader now corrects against the PDF, among others: a proviso of the PMLA's section 44 that the database had lost, the words "is said to commit aggravated sexual assault" that POCSO's section 9 had in the wrong place, and, in section 7 of the Muslim Women Act, a piece of clause (a) copied into clauses (b) and (c) (as the database has it, her relatives could compound the offence and be heard on bail; the PDF says only the woman). The differences left (the PDF's stubs of omitted sections, two slips of the PDF's own text layer, one Act number the database adds) are listed against what the PDF reads. Not on the shelf: the Schedules at the back of POCSO (the armed and security forces), the PMLA (the scheduled offences), the UAPA (the listed organisations and individuals) and the SC/ST Act (the IPC offences), and the State or Union Territory amendments that India Code prints inside three sections (PC Act 17A, POCSO 42, SC/ST 14): they apply only in that State and each of the three sections ends with a one-line note saying they exist. Both two-way comparisons and the Schedules are explained in the last section of the sheet. A program cannot tell whether a provision has since been amended, struck down or read down, or whether the text is the one a court would apply. </w:t>
+        <w:t xml:space="preserve">Recourse can now keep the full text of an Act that is not in its BNS/BNSS library, and hand the sections that bear on a question to the answer model, when the question names that Act (for example "section 45 of the PMLA", "POCSO", "SC/ST Act"). Nine Acts are loaded: the Prevention of Corruption Act, 1988; POCSO, 2012; the UAPA, 1967; the PMLA, 2002; the SC/ST (Prevention of Atrocities) Act, 1989; the Muslim Women (Protection of Rights on Marriage) Act, 2019; the Prevention of Damage to Public Property Act, 1984; the Dowry Prohibition Act, 1961; and the Juvenile Justice (Care and Protection of Children) Act, 2015. Two of them — the Muslim Women Act (8 sections) and the Public Property Act (7) — are short, so when a question names one of those Recourse hands the answer model the whole Act, not the sections closest to the question; this sheet shows every section of those two. For the other seven (including the Dowry Act's 13 sections and the Juvenile Justice Act's 112), the answer model gets the sections closest to the question, and this sheet shows a selection with the reason each is here. The text comes from India Code's own database. A program then compared it with India Code's PDF of the same Act: the arrangement of sections is identical, and every section was read against the PDF's own text word by word, in order, in both directions (so a doubled word, a lost apostrophe or a whole lost proviso is found, not only an unknown word). It found, and the loader now corrects against the PDF, among others: a proviso of the PMLA's section 44 that the database had lost, the words "is said to commit aggravated sexual assault" that POCSO's section 9 had in the wrong place, in section 7 of the Muslim Women Act a piece of clause (a) copied into clauses (b) and (c) (as the database has it, her relatives could compound the offence and be heard on bail; the PDF says only the woman), and in the Juvenile Justice Act's definitions the term "child care institution" overwritten by a stray fragment in the definition of "Child Welfare Officer". The differences left are listed against what the PDF reads. Not on the shelf: the Schedules at the back of POCSO (the armed and security forces), the PMLA (the scheduled offences), the UAPA (the listed organisations and individuals) and the SC/ST Act (the IPC offences); the State or Union Territory amendments that India Code prints inside three sections (PC Act 17A, POCSO 42, SC/ST 14) and the Haryana amendments the PDF appends to the Dowry Act; and the Rules made under any of the Acts (the Juvenile Justice Model Rules among them). Both two-way comparisons and the Schedules are explained in the last section of the sheet. A program cannot tell whether a provision has since been amended, struck down or read down, or whether the text is the one a court would apply. </w:t>
       </w:r>
       <w:r>
         <w:rPr>
@@ -6563,6 +6563,2434 @@
         <w:pStyle w:val="Heading2"/>
       </w:pPr>
       <w:r>
+        <w:t>The Dowry Prohibition Act, 1961 (Act No. 28 of 1961)</w:t>
+      </w:r>
+    </w:p>
+    <w:p>
+      <w:hyperlink r:id="rId23">
+        <w:r>
+          <w:rPr>
+            <w:color w:val="0563C1"/>
+            <w:sz w:val="14"/>
+            <w:u w:val="single"/>
+          </w:rPr>
+          <w:t>open the Act on India Code</w:t>
+        </w:r>
+      </w:hyperlink>
+      <w:r>
+        <w:t xml:space="preserve">   |   </w:t>
+      </w:r>
+      <w:hyperlink r:id="rId24">
+        <w:r>
+          <w:rPr>
+            <w:color w:val="0563C1"/>
+            <w:sz w:val="14"/>
+            <w:u w:val="single"/>
+          </w:rPr>
+          <w:t>its section list</w:t>
+        </w:r>
+      </w:hyperlink>
+    </w:p>
+    <w:p>
+      <w:r>
+        <w:rPr>
+          <w:i/>
+          <w:color w:val="555555"/>
+          <w:sz w:val="16"/>
+        </w:rPr>
+        <w:t>13 sections loaded on 2026-10-17 (some are omitted or repealed and shown as such); compared with India Code's PDF of the Act (the PDF prints no "as on" date): arrangement of sections identical; 13 sections (2,095 words) read against the PDF word by word in both directions, 3 difference(s) left, each explained; 0 correction(s) of India Code's database against the PDF, 1 difference(s) accepted with a reason. India Code's database record was last changed on 10 July 2026; with no date on the PDF, nothing says which of the two is newer. Status: machine_checked (not read by a person).</w:t>
+      </w:r>
+    </w:p>
+    <w:tbl>
+      <w:tblPr>
+        <w:tblStyle w:val="TableGrid"/>
+        <w:tblW w:type="auto" w:w="0"/>
+        <w:tblLook w:firstColumn="1" w:firstRow="1" w:lastColumn="0" w:lastRow="0" w:noHBand="0" w:noVBand="1" w:val="04A0"/>
+      </w:tblPr>
+      <w:tblGrid>
+        <w:gridCol w:w="3563"/>
+        <w:gridCol w:w="3563"/>
+        <w:gridCol w:w="3563"/>
+        <w:gridCol w:w="3563"/>
+      </w:tblGrid>
+      <w:tr>
+        <w:tc>
+          <w:tcPr>
+            <w:tcW w:type="dxa" w:w="850"/>
+          </w:tcPr>
+          <w:p>
+            <w:r/>
+            <w:r>
+              <w:rPr>
+                <w:b/>
+                <w:i w:val="0"/>
+                <w:sz w:val="16"/>
+              </w:rPr>
+              <w:t>Section</w:t>
+            </w:r>
+          </w:p>
+        </w:tc>
+        <w:tc>
+          <w:tcPr>
+            <w:tcW w:type="dxa" w:w="2268"/>
+          </w:tcPr>
+          <w:p>
+            <w:r/>
+            <w:r>
+              <w:rPr>
+                <w:b/>
+                <w:i w:val="0"/>
+                <w:sz w:val="16"/>
+              </w:rPr>
+              <w:t>Why it is on the sheet</w:t>
+            </w:r>
+          </w:p>
+        </w:tc>
+        <w:tc>
+          <w:tcPr>
+            <w:tcW w:type="dxa" w:w="8787"/>
+          </w:tcPr>
+          <w:p>
+            <w:r/>
+            <w:r>
+              <w:rPr>
+                <w:b/>
+                <w:i w:val="0"/>
+                <w:sz w:val="16"/>
+              </w:rPr>
+              <w:t>The text as Recourse holds it</w:t>
+            </w:r>
+          </w:p>
+        </w:tc>
+        <w:tc>
+          <w:tcPr>
+            <w:tcW w:type="dxa" w:w="2948"/>
+          </w:tcPr>
+          <w:p>
+            <w:r/>
+            <w:r>
+              <w:rPr>
+                <w:b/>
+                <w:i w:val="0"/>
+                <w:sz w:val="16"/>
+              </w:rPr>
+              <w:t>Your check: OK, or the correction</w:t>
+            </w:r>
+          </w:p>
+        </w:tc>
+      </w:tr>
+      <w:tr>
+        <w:tc>
+          <w:tcPr>
+            <w:tcW w:type="dxa" w:w="850"/>
+          </w:tcPr>
+          <w:p>
+            <w:r/>
+            <w:r>
+              <w:rPr>
+                <w:b/>
+                <w:i w:val="0"/>
+                <w:sz w:val="16"/>
+              </w:rPr>
+              <w:t>s.2</w:t>
+            </w:r>
+          </w:p>
+        </w:tc>
+        <w:tc>
+          <w:tcPr>
+            <w:tcW w:type="dxa" w:w="2268"/>
+          </w:tcPr>
+          <w:p>
+            <w:r/>
+            <w:r>
+              <w:rPr>
+                <w:b w:val="0"/>
+                <w:i/>
+                <w:color w:val="555555"/>
+                <w:sz w:val="14"/>
+              </w:rPr>
+              <w:t>the definition of “dowry” (evaluation question D04)</w:t>
+            </w:r>
+          </w:p>
+        </w:tc>
+        <w:tc>
+          <w:tcPr>
+            <w:tcW w:type="dxa" w:w="8787"/>
+          </w:tcPr>
+          <w:p>
+            <w:r/>
+            <w:r>
+              <w:rPr>
+                <w:b w:val="0"/>
+                <w:i w:val="0"/>
+                <w:sz w:val="14"/>
+              </w:rPr>
+              <w:t>2. Definition of “dowry”.</w:t>
+              <w:br/>
+              <w:t>In this Act, "dowry" means any property or valuable security given or agreed to be given either directly or indirectly--</w:t>
+              <w:br/>
+              <w:t>(a) by one party to a marriage to the other party to the marriage; or</w:t>
+              <w:br/>
+              <w:t>(b) by the parents of either party to a marriage or by any other person, to either party to the marriage or to any other person;</w:t>
+              <w:br/>
+              <w:t>at or before [or any time after the marriage] [in connection with the marriage of the said parties, but does not include] dower or mahr in the case of persons to whom the Muslim Personal Law (Shariat) applies.</w:t>
+              <w:br/>
+              <w:t>* * * * *</w:t>
+              <w:br/>
+              <w:t>Explanation II.--The expression "valuable security" has the same meaning as in section 30 of the Indian Penal Code (45 of 1860).</w:t>
+            </w:r>
+          </w:p>
+          <w:p>
+            <w:r>
+              <w:rPr>
+                <w:i/>
+                <w:color w:val="555555"/>
+                <w:sz w:val="13"/>
+              </w:rPr>
+              <w:t>Amendment notes India Code prints: 1. Subs. by Act 43 of 1986, s. 2, for "or after the marriage" (w.e.f. 19-11-1986). 2. Subs. by Act 63 of 1984, s. 2, for certain words (w.e.f. 2-10-1985). 3. The Explanation I omitted by s. 2, ibid. (w.e.f. 2-10-1985).</w:t>
+            </w:r>
+          </w:p>
+        </w:tc>
+        <w:tc>
+          <w:tcPr>
+            <w:tcW w:type="dxa" w:w="2948"/>
+          </w:tcPr>
+          <w:p>
+            <w:r/>
+            <w:r>
+              <w:rPr>
+                <w:b w:val="0"/>
+                <w:i w:val="0"/>
+                <w:sz w:val="14"/>
+              </w:rPr>
+            </w:r>
+          </w:p>
+        </w:tc>
+      </w:tr>
+      <w:tr>
+        <w:tc>
+          <w:tcPr>
+            <w:tcW w:type="dxa" w:w="850"/>
+          </w:tcPr>
+          <w:p>
+            <w:r/>
+            <w:r>
+              <w:rPr>
+                <w:b/>
+                <w:i w:val="0"/>
+                <w:sz w:val="16"/>
+              </w:rPr>
+              <w:t>s.3</w:t>
+            </w:r>
+          </w:p>
+        </w:tc>
+        <w:tc>
+          <w:tcPr>
+            <w:tcW w:type="dxa" w:w="2268"/>
+          </w:tcPr>
+          <w:p>
+            <w:r/>
+            <w:r>
+              <w:rPr>
+                <w:b w:val="0"/>
+                <w:i/>
+                <w:color w:val="555555"/>
+                <w:sz w:val="14"/>
+              </w:rPr>
+              <w:t>the offence of giving or taking dowry, and its punishment (D02, D03)</w:t>
+            </w:r>
+          </w:p>
+        </w:tc>
+        <w:tc>
+          <w:tcPr>
+            <w:tcW w:type="dxa" w:w="8787"/>
+          </w:tcPr>
+          <w:p>
+            <w:r/>
+            <w:r>
+              <w:rPr>
+                <w:b w:val="0"/>
+                <w:i w:val="0"/>
+                <w:sz w:val="14"/>
+              </w:rPr>
+              <w:t>3. Penalty for giving or taking dowry.</w:t>
+              <w:br/>
+              <w:t>[(1)] If any person, after the commencement of this Act, gives or takes or abets the giving or taking of dowry, he shall be punishable [with imprisonment for a term which shall not be less than [five years, and with fine which shall not be less than fifteen thousand rupees or the amount of the value of such dowry, whichever is more]:</w:t>
+              <w:br/>
+              <w:t>Provided that the Court may, for adequate and special reasons to be recorded in the judgment, impose a sentence of imprisonment for a term of less than [five years].]</w:t>
+              <w:br/>
+              <w:t>[(2) Nothing in sub-section (1) shall apply to, or in relation to,--</w:t>
+              <w:br/>
+              <w:t>(a) presents which are given at the time of a marriage to the bride (without any demand having been made in that behalf):</w:t>
+              <w:br/>
+              <w:t>Provided that such presents are entered in a list maintained in accordance with the rules made under this Act;</w:t>
+              <w:br/>
+              <w:t>(b) presents which are given at the time of a marriage to the bridegroom (without any demand having been made in that behalf):</w:t>
+              <w:br/>
+              <w:t>Provided that such presents are entered in a list maintained in accordance with the rules made under this Act:</w:t>
+              <w:br/>
+              <w:t>Provided further that where such presents are made by or on behalf of the bride or any person related to the bride, such presents are of a customary nature and the value thereof is not excessive having regard to the financial status of the person by whom, or on whose behalf, such presents are given.]</w:t>
+            </w:r>
+          </w:p>
+          <w:p>
+            <w:r>
+              <w:rPr>
+                <w:i/>
+                <w:color w:val="555555"/>
+                <w:sz w:val="13"/>
+              </w:rPr>
+              <w:t>Amendment notes India Code prints: 1. Section 3 renumbered as sub-section (1) of that section by s. 3, ibid. (w.e.f. 2-10-1985). 2. Subs. by s. 3, ibid., for certain words (w.e.f. 2-10-1985). 3. Subs. by Act 43 of 1986, s. 3, for certain words (w.e.f. 19-11-1986). 4. Subs. by s. 3, ibid., for "six months" (w.e.f. 19-11-1986). 5. Ins. by Act 63 of 1984, s. 3 (w.e.f. 2-10-1985).</w:t>
+            </w:r>
+          </w:p>
+        </w:tc>
+        <w:tc>
+          <w:tcPr>
+            <w:tcW w:type="dxa" w:w="2948"/>
+          </w:tcPr>
+          <w:p>
+            <w:r/>
+            <w:r>
+              <w:rPr>
+                <w:b w:val="0"/>
+                <w:i w:val="0"/>
+                <w:sz w:val="14"/>
+              </w:rPr>
+            </w:r>
+          </w:p>
+        </w:tc>
+      </w:tr>
+      <w:tr>
+        <w:tc>
+          <w:tcPr>
+            <w:tcW w:type="dxa" w:w="850"/>
+          </w:tcPr>
+          <w:p>
+            <w:r/>
+            <w:r>
+              <w:rPr>
+                <w:b/>
+                <w:i w:val="0"/>
+                <w:sz w:val="16"/>
+              </w:rPr>
+              <w:t>s.4</w:t>
+            </w:r>
+          </w:p>
+        </w:tc>
+        <w:tc>
+          <w:tcPr>
+            <w:tcW w:type="dxa" w:w="2268"/>
+          </w:tcPr>
+          <w:p>
+            <w:r/>
+            <w:r>
+              <w:rPr>
+                <w:b w:val="0"/>
+                <w:i/>
+                <w:color w:val="555555"/>
+                <w:sz w:val="14"/>
+              </w:rPr>
+              <w:t>the offence of demanding dowry (D01)</w:t>
+            </w:r>
+          </w:p>
+        </w:tc>
+        <w:tc>
+          <w:tcPr>
+            <w:tcW w:type="dxa" w:w="8787"/>
+          </w:tcPr>
+          <w:p>
+            <w:r/>
+            <w:r>
+              <w:rPr>
+                <w:b w:val="0"/>
+                <w:i w:val="0"/>
+                <w:sz w:val="14"/>
+              </w:rPr>
+              <w:t>4. Penalty for demanding dowry.</w:t>
+              <w:br/>
+              <w:t>[If any person demands, directly or indirectly, from the parents or other relatives or guardian of a bride or bridegroom, as the case may be, any dowry, he shall be punishable with imprisonment for a term which shall not be less than six months, but which may extend to two years and with fine which may extend to ten thousand rupees:</w:t>
+              <w:br/>
+              <w:t>Provided that the Court may, for adequate and special reasons to be mentioned in the judgment, impose a sentence of imprisonment for a term of less than six months.]</w:t>
+            </w:r>
+          </w:p>
+          <w:p>
+            <w:r>
+              <w:rPr>
+                <w:i/>
+                <w:color w:val="555555"/>
+                <w:sz w:val="13"/>
+              </w:rPr>
+              <w:t>Amendment notes India Code prints: 1. Subs. by Act 63 of 1984, s. 4, for section 4 (w.e.f. 2-10-1985).</w:t>
+            </w:r>
+          </w:p>
+        </w:tc>
+        <w:tc>
+          <w:tcPr>
+            <w:tcW w:type="dxa" w:w="2948"/>
+          </w:tcPr>
+          <w:p>
+            <w:r/>
+            <w:r>
+              <w:rPr>
+                <w:b w:val="0"/>
+                <w:i w:val="0"/>
+                <w:sz w:val="14"/>
+              </w:rPr>
+            </w:r>
+          </w:p>
+        </w:tc>
+      </w:tr>
+      <w:tr>
+        <w:tc>
+          <w:tcPr>
+            <w:tcW w:type="dxa" w:w="850"/>
+          </w:tcPr>
+          <w:p>
+            <w:r/>
+            <w:r>
+              <w:rPr>
+                <w:b/>
+                <w:i w:val="0"/>
+                <w:sz w:val="16"/>
+              </w:rPr>
+              <w:t>s.4A</w:t>
+            </w:r>
+          </w:p>
+        </w:tc>
+        <w:tc>
+          <w:tcPr>
+            <w:tcW w:type="dxa" w:w="2268"/>
+          </w:tcPr>
+          <w:p>
+            <w:r/>
+            <w:r>
+              <w:rPr>
+                <w:b w:val="0"/>
+                <w:i/>
+                <w:color w:val="555555"/>
+                <w:sz w:val="14"/>
+              </w:rPr>
+              <w:t>ban on advertising a dowry demand (D05)</w:t>
+            </w:r>
+          </w:p>
+        </w:tc>
+        <w:tc>
+          <w:tcPr>
+            <w:tcW w:type="dxa" w:w="8787"/>
+          </w:tcPr>
+          <w:p>
+            <w:r/>
+            <w:r>
+              <w:rPr>
+                <w:b w:val="0"/>
+                <w:i w:val="0"/>
+                <w:sz w:val="14"/>
+              </w:rPr>
+              <w:t>4A. Ban on advertisement.</w:t>
+              <w:br/>
+              <w:t>[If any person--</w:t>
+              <w:br/>
+              <w:t>(a) offers, through any advertisement in any newspaper, periodical, journal or through any other media, any share in his property or of any money or both as a share in any business or other interest as consideration for the marriage of his son or daughter or any other relative,</w:t>
+              <w:br/>
+              <w:t>(b) prints or publishes or circulates any advertisement referred to in clause (a),</w:t>
+              <w:br/>
+              <w:t>he shall be punishable with imprisonment for a term which shall not be less than six months, but which may extend to five years, or with fine which may extend to fifteen thousand rupees:</w:t>
+              <w:br/>
+              <w:t>Provided that the Court may, for adequate and special reasons to be recorded in the judgment, impose a sentence of imprisonment for a term of less than six months.]</w:t>
+            </w:r>
+          </w:p>
+          <w:p>
+            <w:r>
+              <w:rPr>
+                <w:i/>
+                <w:color w:val="555555"/>
+                <w:sz w:val="13"/>
+              </w:rPr>
+              <w:t>Amendment notes India Code prints: 1. Ins. by Act 43 of 1986, s. 4 (w.e.f. 19-11-1986).</w:t>
+            </w:r>
+          </w:p>
+        </w:tc>
+        <w:tc>
+          <w:tcPr>
+            <w:tcW w:type="dxa" w:w="2948"/>
+          </w:tcPr>
+          <w:p>
+            <w:r/>
+            <w:r>
+              <w:rPr>
+                <w:b w:val="0"/>
+                <w:i w:val="0"/>
+                <w:sz w:val="14"/>
+              </w:rPr>
+            </w:r>
+          </w:p>
+        </w:tc>
+      </w:tr>
+      <w:tr>
+        <w:tc>
+          <w:tcPr>
+            <w:tcW w:type="dxa" w:w="850"/>
+          </w:tcPr>
+          <w:p>
+            <w:r/>
+            <w:r>
+              <w:rPr>
+                <w:b/>
+                <w:i w:val="0"/>
+                <w:sz w:val="16"/>
+              </w:rPr>
+              <w:t>s.5</w:t>
+            </w:r>
+          </w:p>
+        </w:tc>
+        <w:tc>
+          <w:tcPr>
+            <w:tcW w:type="dxa" w:w="2268"/>
+          </w:tcPr>
+          <w:p>
+            <w:r/>
+            <w:r>
+              <w:rPr>
+                <w:b w:val="0"/>
+                <w:i/>
+                <w:color w:val="555555"/>
+                <w:sz w:val="14"/>
+              </w:rPr>
+              <w:t>an agreement to give or take dowry is void (D06)</w:t>
+            </w:r>
+          </w:p>
+        </w:tc>
+        <w:tc>
+          <w:tcPr>
+            <w:tcW w:type="dxa" w:w="8787"/>
+          </w:tcPr>
+          <w:p>
+            <w:r/>
+            <w:r>
+              <w:rPr>
+                <w:b w:val="0"/>
+                <w:i w:val="0"/>
+                <w:sz w:val="14"/>
+              </w:rPr>
+              <w:t>5. Agreement for giving or taking dowry to be void.</w:t>
+              <w:br/>
+              <w:t>Any agreement for the giving or taking of dowry shall be void.</w:t>
+            </w:r>
+          </w:p>
+        </w:tc>
+        <w:tc>
+          <w:tcPr>
+            <w:tcW w:type="dxa" w:w="2948"/>
+          </w:tcPr>
+          <w:p>
+            <w:r/>
+            <w:r>
+              <w:rPr>
+                <w:b w:val="0"/>
+                <w:i w:val="0"/>
+                <w:sz w:val="14"/>
+              </w:rPr>
+            </w:r>
+          </w:p>
+        </w:tc>
+      </w:tr>
+      <w:tr>
+        <w:tc>
+          <w:tcPr>
+            <w:tcW w:type="dxa" w:w="850"/>
+          </w:tcPr>
+          <w:p>
+            <w:r/>
+            <w:r>
+              <w:rPr>
+                <w:b/>
+                <w:i w:val="0"/>
+                <w:sz w:val="16"/>
+              </w:rPr>
+              <w:t>s.6</w:t>
+            </w:r>
+          </w:p>
+        </w:tc>
+        <w:tc>
+          <w:tcPr>
+            <w:tcW w:type="dxa" w:w="2268"/>
+          </w:tcPr>
+          <w:p>
+            <w:r/>
+            <w:r>
+              <w:rPr>
+                <w:b w:val="0"/>
+                <w:i/>
+                <w:color w:val="555555"/>
+                <w:sz w:val="14"/>
+              </w:rPr>
+              <w:t>dowry is for the benefit of the wife or her heirs (D07)</w:t>
+            </w:r>
+          </w:p>
+        </w:tc>
+        <w:tc>
+          <w:tcPr>
+            <w:tcW w:type="dxa" w:w="8787"/>
+          </w:tcPr>
+          <w:p>
+            <w:r/>
+            <w:r>
+              <w:rPr>
+                <w:b w:val="0"/>
+                <w:i w:val="0"/>
+                <w:sz w:val="14"/>
+              </w:rPr>
+              <w:t>6. Dowry to be for the benefit of the wife or her heirs.</w:t>
+              <w:br/>
+              <w:t>(1) Where any dowry is received by any person other than the woman in connection with whose marriage it is given, that person shall transfer it to the woman--</w:t>
+              <w:br/>
+              <w:t>(a) if the dowry was received before marriage, within[three months] after the date of marriage; or</w:t>
+              <w:br/>
+              <w:t>(b) if the dowry was received at the time of or after the marriage, within [three months] after the date of its receipt; or</w:t>
+              <w:br/>
+              <w:t>(c) if the dowry was received when the woman was a minor, within [three months] after she has attained the age of eighteen years;</w:t>
+              <w:br/>
+              <w:t>and pending such transfer, shall hold it in trust for the benefit of the woman.</w:t>
+              <w:br/>
+              <w:t>[(2) If any person fails to transfer any property as required by sub-section (1) within the time limit specified therefor [or as required by sub-section (3),] he shall be punishable with imprisonment for a term which shall not be less than six months, but which may extend to two years or with fine [which shall not be less than five thousand rupees, but which may extend to ten thousand rupees] or with both.]</w:t>
+              <w:br/>
+              <w:t>(3) Where the woman entitled to any property under sub-section (1) dies before receiving it, the heirs of the woman shall be entitled to claim it from the person holding it for the time being:</w:t>
+              <w:br/>
+              <w:t>[Provided that where such woman dies within seven years of her marriage, otherwise than due to natural causes, such property shall,--</w:t>
+              <w:br/>
+              <w:t>(a) if she has no children, be transferred to her parents, or</w:t>
+              <w:br/>
+              <w:t>(b) if she has children, be transferred to such children and pending such transfer, be held in trust for such children.]</w:t>
+              <w:br/>
+              <w:t>[(3A) Where a person convicted under sub-section (2) for failure to transfer any property as required by sub-section (1) [or sub-section (3)] has not, before his conviction under that sub-section, transferred such property to the woman entitled thereto or, as the case may be, [her heirs, parents or children] the Court shall, in addition to awarding punishment under that sub-section, direct, by order in writing, that such person shall transfer the property to such woman or, as the case may be, [her heirs, parents or children] within such period as may be specified in the order, and if such person fails to comply with the direction within the period so specified, an amount equal to the value of the property may be recovered from him as if it were a fine imposed by such Court and paid to such woman or, as the case may be, [her heirs, parents or children].]</w:t>
+              <w:br/>
+              <w:t>(4) Nothing contained in this section shall affect the provisions of section 3 or section 4.</w:t>
+            </w:r>
+          </w:p>
+          <w:p>
+            <w:r>
+              <w:rPr>
+                <w:i/>
+                <w:color w:val="555555"/>
+                <w:sz w:val="13"/>
+              </w:rPr>
+              <w:t>Amendment notes India Code prints: 1. Subs. by Act 63 of 1984, s. 5, for "one year" (w.e.f. 2-10-1985). 2. Subs. by s. 5, ibid., for sub-section (2) (w.e.f. 2-10-1985). 3. Ins. by Act 43 of 1986, s. 5 (w.e.f. 19-11-1986). 4. Subs. by s. 5, ibid., for "which may extend to ten thousand rupees" (w.e.f. 19-11-1986). 5. The proviso inserted by s. 5, ibid. (w.e.f. 19-11-1986). 6. Ins. by Act 63 of 1984, s. 5 (w.e.f. 2-10-1985). 7. Ins. by Act 43 of 1986, s. 5 (w.e.f. 19-11-1986). 8. Subs. by s. 5, ibid., for "her heirs" (w.e.f. 19-11-1986).</w:t>
+            </w:r>
+          </w:p>
+        </w:tc>
+        <w:tc>
+          <w:tcPr>
+            <w:tcW w:type="dxa" w:w="2948"/>
+          </w:tcPr>
+          <w:p>
+            <w:r/>
+            <w:r>
+              <w:rPr>
+                <w:b w:val="0"/>
+                <w:i w:val="0"/>
+                <w:sz w:val="14"/>
+              </w:rPr>
+            </w:r>
+          </w:p>
+        </w:tc>
+      </w:tr>
+      <w:tr>
+        <w:tc>
+          <w:tcPr>
+            <w:tcW w:type="dxa" w:w="850"/>
+          </w:tcPr>
+          <w:p>
+            <w:r/>
+            <w:r>
+              <w:rPr>
+                <w:b/>
+                <w:i w:val="0"/>
+                <w:sz w:val="16"/>
+              </w:rPr>
+              <w:t>s.7</w:t>
+            </w:r>
+          </w:p>
+        </w:tc>
+        <w:tc>
+          <w:tcPr>
+            <w:tcW w:type="dxa" w:w="2268"/>
+          </w:tcPr>
+          <w:p>
+            <w:r/>
+            <w:r>
+              <w:rPr>
+                <w:b w:val="0"/>
+                <w:i/>
+                <w:color w:val="555555"/>
+                <w:sz w:val="14"/>
+              </w:rPr>
+              <w:t>cognizance of offences: which court, and the time limit (D08)</w:t>
+            </w:r>
+          </w:p>
+        </w:tc>
+        <w:tc>
+          <w:tcPr>
+            <w:tcW w:type="dxa" w:w="8787"/>
+          </w:tcPr>
+          <w:p>
+            <w:r/>
+            <w:r>
+              <w:rPr>
+                <w:b w:val="0"/>
+                <w:i w:val="0"/>
+                <w:sz w:val="14"/>
+              </w:rPr>
+              <w:t>7. Cognizance of offences.</w:t>
+              <w:br/>
+              <w:t>[(1) Notwithstanding anything contained in the Code of Criminal Procedure, 1973 (2 of 1974),--</w:t>
+              <w:br/>
+              <w:t>(a) no Court inferior to that of a Metropolitan Magistrate or a Judicial Magistrate of the first class shall try any offence under this Act;</w:t>
+              <w:br/>
+              <w:t>(b) no court shall take cognizance of an offence under this Act except upon--</w:t>
+              <w:br/>
+              <w:t>(i) its own knowledge or a police report of the facts which constitute such offence, or</w:t>
+              <w:br/>
+              <w:t>(ii) a complaint by the person aggrieved by the offence or a parent or other relative of such person, or by any recognised welfare institution or organisation;</w:t>
+              <w:br/>
+              <w:t>(c) it shall be lawful for a Metropolitan Magistrate or a Judicial Magistrate of the first class to pass any sentence authorised by this Act on any person convicted of an offence under this Act.</w:t>
+              <w:br/>
+              <w:t>Explanation.--For the purposes of this sub-section, "recognised welfare institution or organisation" means a social welfare institution or organisation recognised in this behalf by the Central or State Government.</w:t>
+              <w:br/>
+              <w:t>(2) Nothing in Chapter XXXVI of the Code of Criminal Procedure, 1973 (2 of 1974), shall apply to any offence punishable under this Act.]</w:t>
+              <w:br/>
+              <w:t>[(3) Notwithstanding anything contained in any law for the time being in force a statement made by the person aggrieved by the offence shall not subject such person to a prosecution under this Act.]</w:t>
+            </w:r>
+          </w:p>
+          <w:p>
+            <w:r>
+              <w:rPr>
+                <w:i/>
+                <w:color w:val="555555"/>
+                <w:sz w:val="13"/>
+              </w:rPr>
+              <w:t>Amendment notes India Code prints: 1. Subs. by Act 63 of 1984, s. 6, for section 7 (w.e.f. 2-10-1985). 2. Ins. by Act 43 of 1986, s. 6 (w.e.f. 19-11-1986).</w:t>
+            </w:r>
+          </w:p>
+        </w:tc>
+        <w:tc>
+          <w:tcPr>
+            <w:tcW w:type="dxa" w:w="2948"/>
+          </w:tcPr>
+          <w:p>
+            <w:r/>
+            <w:r>
+              <w:rPr>
+                <w:b w:val="0"/>
+                <w:i w:val="0"/>
+                <w:sz w:val="14"/>
+              </w:rPr>
+            </w:r>
+          </w:p>
+        </w:tc>
+      </w:tr>
+      <w:tr>
+        <w:tc>
+          <w:tcPr>
+            <w:tcW w:type="dxa" w:w="850"/>
+          </w:tcPr>
+          <w:p>
+            <w:r/>
+            <w:r>
+              <w:rPr>
+                <w:b/>
+                <w:i w:val="0"/>
+                <w:sz w:val="16"/>
+              </w:rPr>
+              <w:t>s.8</w:t>
+            </w:r>
+          </w:p>
+        </w:tc>
+        <w:tc>
+          <w:tcPr>
+            <w:tcW w:type="dxa" w:w="2268"/>
+          </w:tcPr>
+          <w:p>
+            <w:r/>
+            <w:r>
+              <w:rPr>
+                <w:b w:val="0"/>
+                <w:i/>
+                <w:color w:val="555555"/>
+                <w:sz w:val="14"/>
+              </w:rPr>
+              <w:t>offences cognizable, bailable and non-compoundable (D09)</w:t>
+            </w:r>
+          </w:p>
+        </w:tc>
+        <w:tc>
+          <w:tcPr>
+            <w:tcW w:type="dxa" w:w="8787"/>
+          </w:tcPr>
+          <w:p>
+            <w:r/>
+            <w:r>
+              <w:rPr>
+                <w:b w:val="0"/>
+                <w:i w:val="0"/>
+                <w:sz w:val="14"/>
+              </w:rPr>
+              <w:t>8. Offences to be cognizable for certain purposes and to be bailable and non-compoundable.</w:t>
+              <w:br/>
+              <w:t>[(1) The Code of Criminal Procedure, 1973 (2 of 1974) shall apply to offences under this Act as if they were cognizable offences--</w:t>
+              <w:br/>
+              <w:t>(a) for the purposes of investigation of such offences; and</w:t>
+              <w:br/>
+              <w:t>(b) for the purposes of matters other than--</w:t>
+              <w:br/>
+              <w:t>(i) matters referred to in section 42 of that Code; and</w:t>
+              <w:br/>
+              <w:t>(ii) the arrest of a person without a warrant or without an order of a Magistrate.</w:t>
+              <w:br/>
+              <w:t>(2) Every offence under this Act shall be [non-bailable] and non-compoundable.]</w:t>
+            </w:r>
+          </w:p>
+          <w:p>
+            <w:r>
+              <w:rPr>
+                <w:i/>
+                <w:color w:val="555555"/>
+                <w:sz w:val="13"/>
+              </w:rPr>
+              <w:t>Amendment notes India Code prints: 2. Subs. by Act 63 of 1984, s. 7, for section 8 (w.e.f. 2-10-1985). 2. Subs. by Act 43 of 1986, s. 7, for "bailable" (w.e.f. 19-11-1986).</w:t>
+            </w:r>
+          </w:p>
+        </w:tc>
+        <w:tc>
+          <w:tcPr>
+            <w:tcW w:type="dxa" w:w="2948"/>
+          </w:tcPr>
+          <w:p>
+            <w:r/>
+            <w:r>
+              <w:rPr>
+                <w:b w:val="0"/>
+                <w:i w:val="0"/>
+                <w:sz w:val="14"/>
+              </w:rPr>
+            </w:r>
+          </w:p>
+        </w:tc>
+      </w:tr>
+      <w:tr>
+        <w:tc>
+          <w:tcPr>
+            <w:tcW w:type="dxa" w:w="850"/>
+          </w:tcPr>
+          <w:p>
+            <w:r/>
+            <w:r>
+              <w:rPr>
+                <w:b/>
+                <w:i w:val="0"/>
+                <w:sz w:val="16"/>
+              </w:rPr>
+              <w:t>s.8A</w:t>
+            </w:r>
+          </w:p>
+        </w:tc>
+        <w:tc>
+          <w:tcPr>
+            <w:tcW w:type="dxa" w:w="2268"/>
+          </w:tcPr>
+          <w:p>
+            <w:r/>
+            <w:r>
+              <w:rPr>
+                <w:b w:val="0"/>
+                <w:i/>
+                <w:color w:val="555555"/>
+                <w:sz w:val="14"/>
+              </w:rPr>
+              <w:t>burden of proof in a dowry prosecution (D10)</w:t>
+            </w:r>
+          </w:p>
+        </w:tc>
+        <w:tc>
+          <w:tcPr>
+            <w:tcW w:type="dxa" w:w="8787"/>
+          </w:tcPr>
+          <w:p>
+            <w:r/>
+            <w:r>
+              <w:rPr>
+                <w:b w:val="0"/>
+                <w:i w:val="0"/>
+                <w:sz w:val="14"/>
+              </w:rPr>
+              <w:t>8A. Burden of proof in certain cases</w:t>
+              <w:br/>
+              <w:t>[Where any person is prosecuted for taking or abetting the taking of any dowry under section 3, or the demanding of dowry under section 4, the burden of proving that he had not committed an offence under those sections shall be on him.]</w:t>
+            </w:r>
+          </w:p>
+          <w:p>
+            <w:r>
+              <w:rPr>
+                <w:i/>
+                <w:color w:val="555555"/>
+                <w:sz w:val="13"/>
+              </w:rPr>
+              <w:t>Amendment notes India Code prints: 1. Ins. by s. 8, ibid. (w.e.f. 19-11-1986).</w:t>
+            </w:r>
+          </w:p>
+        </w:tc>
+        <w:tc>
+          <w:tcPr>
+            <w:tcW w:type="dxa" w:w="2948"/>
+          </w:tcPr>
+          <w:p>
+            <w:r/>
+            <w:r>
+              <w:rPr>
+                <w:b w:val="0"/>
+                <w:i w:val="0"/>
+                <w:sz w:val="14"/>
+              </w:rPr>
+            </w:r>
+          </w:p>
+        </w:tc>
+      </w:tr>
+      <w:tr>
+        <w:tc>
+          <w:tcPr>
+            <w:tcW w:type="dxa" w:w="850"/>
+          </w:tcPr>
+          <w:p>
+            <w:r/>
+            <w:r>
+              <w:rPr>
+                <w:b/>
+                <w:i w:val="0"/>
+                <w:sz w:val="16"/>
+              </w:rPr>
+              <w:t>s.8B</w:t>
+            </w:r>
+          </w:p>
+        </w:tc>
+        <w:tc>
+          <w:tcPr>
+            <w:tcW w:type="dxa" w:w="2268"/>
+          </w:tcPr>
+          <w:p>
+            <w:r/>
+            <w:r>
+              <w:rPr>
+                <w:b w:val="0"/>
+                <w:i/>
+                <w:color w:val="555555"/>
+                <w:sz w:val="14"/>
+              </w:rPr>
+              <w:t>Dowry Prohibition Officers (D11)</w:t>
+            </w:r>
+          </w:p>
+        </w:tc>
+        <w:tc>
+          <w:tcPr>
+            <w:tcW w:type="dxa" w:w="8787"/>
+          </w:tcPr>
+          <w:p>
+            <w:r/>
+            <w:r>
+              <w:rPr>
+                <w:b w:val="0"/>
+                <w:i w:val="0"/>
+                <w:sz w:val="14"/>
+              </w:rPr>
+              <w:t>8B. Dowry Prohibition Officers</w:t>
+              <w:br/>
+              <w:t>(1) The State Government may appoint as many Dowry Prohibition Officers as it thinks fit and specify the areas in respect of which they shall exercise their jurisdiction and powers under this Act.</w:t>
+              <w:br/>
+              <w:t>(2) Every Dowry Prohibition Officer shall exercise and perform the following powers and functions, namely:--</w:t>
+              <w:br/>
+              <w:t>(a) to see that the provisions of this Act are complied with;</w:t>
+              <w:br/>
+              <w:t>(b) to prevent, as far as possible, the taking or abetting the taking of, or the demanding of, dowry;</w:t>
+              <w:br/>
+              <w:t>(c) to collect such evidence as may be necessary for the prosecution of persons committing offences under the Act; and</w:t>
+              <w:br/>
+              <w:t>(d) to perform such additional functions as may be assigned to him by the State Government, or as may be specified in the rules made under this Act.</w:t>
+              <w:br/>
+              <w:t>(3) The State Government may, by notification in the Official Gazette, confer such powers of a police officer as may be specified in the notification on the Dowry Prohibition Officer who shall exercise such powers subject to such limitations and conditions as may be specified by rules made under this Act.</w:t>
+              <w:br/>
+              <w:t>(4) The State Government may, for the purpose of advising and assisting Dowry Prohibition Officers in the efficient performance of their functions under this Act, appoint an advisory board consisting of not more than five social welfare workers (out of whom at least two shall be women) from the area in respect of which such Dowry Prohibition Officer exercises jurisdiction under sub-section (1).]</w:t>
+            </w:r>
+          </w:p>
+        </w:tc>
+        <w:tc>
+          <w:tcPr>
+            <w:tcW w:type="dxa" w:w="2948"/>
+          </w:tcPr>
+          <w:p>
+            <w:r/>
+            <w:r>
+              <w:rPr>
+                <w:b w:val="0"/>
+                <w:i w:val="0"/>
+                <w:sz w:val="14"/>
+              </w:rPr>
+            </w:r>
+          </w:p>
+        </w:tc>
+      </w:tr>
+    </w:tbl>
+    <w:p>
+      <w:r>
+        <w:rPr>
+          <w:i/>
+          <w:color w:val="555555"/>
+          <w:sz w:val="16"/>
+        </w:rPr>
+        <w:t>Differences left as India Code's database has them, with the reason. (1) s.6 ("therefor"): The PDF prints “therefor” immediately followed by an amendment bracket with no space (“specified therefor[or as required by sub-section (3),]”), so “therefor” is not a separate word in the PDF's word list although it is present in the PDF; the database spaces it. “therefor” (= for that) is the correct legal word, not a misspelling of “therefore”.</w:t>
+      </w:r>
+    </w:p>
+    <w:p>
+      <w:pPr>
+        <w:pStyle w:val="Heading2"/>
+      </w:pPr>
+      <w:r>
+        <w:t>The Juvenile Justice (Care and Protection of Children) Act, 2015 (Act No. 2 of 2016)</w:t>
+      </w:r>
+    </w:p>
+    <w:p>
+      <w:hyperlink r:id="rId25">
+        <w:r>
+          <w:rPr>
+            <w:color w:val="0563C1"/>
+            <w:sz w:val="14"/>
+            <w:u w:val="single"/>
+          </w:rPr>
+          <w:t>open the Act on India Code</w:t>
+        </w:r>
+      </w:hyperlink>
+      <w:r>
+        <w:t xml:space="preserve">   |   </w:t>
+      </w:r>
+      <w:hyperlink r:id="rId26">
+        <w:r>
+          <w:rPr>
+            <w:color w:val="0563C1"/>
+            <w:sz w:val="14"/>
+            <w:u w:val="single"/>
+          </w:rPr>
+          <w:t>its section list</w:t>
+        </w:r>
+      </w:hyperlink>
+    </w:p>
+    <w:p>
+      <w:r>
+        <w:rPr>
+          <w:i/>
+          <w:color w:val="555555"/>
+          <w:sz w:val="16"/>
+        </w:rPr>
+        <w:t>112 sections loaded on 2026-10-17 (some are omitted or repealed and shown as such); compared with India Code's PDF of the Act (the PDF prints no "as on" date): arrangement of sections identical; 112 sections (25,886 words) read against the PDF word by word in both directions, 1 difference(s) left, each explained; 30 correction(s) of India Code's database against the PDF, 0 difference(s) accepted with a reason. India Code's database record was last changed on 10 July 2026; with no date on the PDF, nothing says which of the two is newer. Status: machine_checked (not read by a person).</w:t>
+      </w:r>
+    </w:p>
+    <w:tbl>
+      <w:tblPr>
+        <w:tblStyle w:val="TableGrid"/>
+        <w:tblW w:type="auto" w:w="0"/>
+        <w:tblLook w:firstColumn="1" w:firstRow="1" w:lastColumn="0" w:lastRow="0" w:noHBand="0" w:noVBand="1" w:val="04A0"/>
+      </w:tblPr>
+      <w:tblGrid>
+        <w:gridCol w:w="3563"/>
+        <w:gridCol w:w="3563"/>
+        <w:gridCol w:w="3563"/>
+        <w:gridCol w:w="3563"/>
+      </w:tblGrid>
+      <w:tr>
+        <w:tc>
+          <w:tcPr>
+            <w:tcW w:type="dxa" w:w="850"/>
+          </w:tcPr>
+          <w:p>
+            <w:r/>
+            <w:r>
+              <w:rPr>
+                <w:b/>
+                <w:i w:val="0"/>
+                <w:sz w:val="16"/>
+              </w:rPr>
+              <w:t>Section</w:t>
+            </w:r>
+          </w:p>
+        </w:tc>
+        <w:tc>
+          <w:tcPr>
+            <w:tcW w:type="dxa" w:w="2268"/>
+          </w:tcPr>
+          <w:p>
+            <w:r/>
+            <w:r>
+              <w:rPr>
+                <w:b/>
+                <w:i w:val="0"/>
+                <w:sz w:val="16"/>
+              </w:rPr>
+              <w:t>Why it is on the sheet</w:t>
+            </w:r>
+          </w:p>
+        </w:tc>
+        <w:tc>
+          <w:tcPr>
+            <w:tcW w:type="dxa" w:w="8787"/>
+          </w:tcPr>
+          <w:p>
+            <w:r/>
+            <w:r>
+              <w:rPr>
+                <w:b/>
+                <w:i w:val="0"/>
+                <w:sz w:val="16"/>
+              </w:rPr>
+              <w:t>The text as Recourse holds it</w:t>
+            </w:r>
+          </w:p>
+        </w:tc>
+        <w:tc>
+          <w:tcPr>
+            <w:tcW w:type="dxa" w:w="2948"/>
+          </w:tcPr>
+          <w:p>
+            <w:r/>
+            <w:r>
+              <w:rPr>
+                <w:b/>
+                <w:i w:val="0"/>
+                <w:sz w:val="16"/>
+              </w:rPr>
+              <w:t>Your check: OK, or the correction</w:t>
+            </w:r>
+          </w:p>
+        </w:tc>
+      </w:tr>
+      <w:tr>
+        <w:tc>
+          <w:tcPr>
+            <w:tcW w:type="dxa" w:w="850"/>
+          </w:tcPr>
+          <w:p>
+            <w:r/>
+            <w:r>
+              <w:rPr>
+                <w:b/>
+                <w:i w:val="0"/>
+                <w:sz w:val="16"/>
+              </w:rPr>
+              <w:t>s.2</w:t>
+            </w:r>
+          </w:p>
+        </w:tc>
+        <w:tc>
+          <w:tcPr>
+            <w:tcW w:type="dxa" w:w="2268"/>
+          </w:tcPr>
+          <w:p>
+            <w:r/>
+            <w:r>
+              <w:rPr>
+                <w:b w:val="0"/>
+                <w:i/>
+                <w:color w:val="555555"/>
+                <w:sz w:val="14"/>
+              </w:rPr>
+              <w:t>definitions, including who is a “child” (J17). CORRECTED against the PDF: the definition of “Child Welfare Officer” was garbled in India Code's database — see the note under this table</w:t>
+            </w:r>
+          </w:p>
+        </w:tc>
+        <w:tc>
+          <w:tcPr>
+            <w:tcW w:type="dxa" w:w="8787"/>
+          </w:tcPr>
+          <w:p>
+            <w:r/>
+            <w:r>
+              <w:rPr>
+                <w:b w:val="0"/>
+                <w:i w:val="0"/>
+                <w:sz w:val="14"/>
+              </w:rPr>
+              <w:t>2. Definitions.</w:t>
+              <w:br/>
+              <w:t>In this Act, unless the context otherwise requires,---</w:t>
+              <w:br/>
+              <w:t>(1) "abandoned child" means a child deserted by his biological or adoptive parents or guardians, who has been declared as abandoned by the Committee after due inquiry;</w:t>
+              <w:br/>
+              <w:t>(2) "adoption" means the process through which the adopted child is permanently separated from his biological parents and becomes the lawful child of his adoptive parents with all the rights, privileges and responsibilities that are attached to a biological child;</w:t>
+              <w:br/>
+              <w:t>(3) "adoption regulations" means the regulations framed by the Authority and notified by the Central Government in respect of adoption;</w:t>
+              <w:br/>
+              <w:t>******</w:t>
+              <w:br/>
+              <w:t>(5) "aftercare" means making provision of support, financial or otherwise, to persons, who have completed the age of eighteen years but have not completed the age of twenty-one years, and have left any institutional care to join the mainstream of the society;</w:t>
+              <w:br/>
+              <w:t>(6) "authorised foreign adoption agency" means a foreign social or child welfare agency that is authorised by the Central Adoption Resource Authority on the recommendation of their Central Authority or Government department of that country for sponsoring the application of non-resident Indian or overseas citizen of India or persons of Indian origin or foreign prospective adoptive parents for adoption of a child from India;</w:t>
+              <w:br/>
+              <w:t>(7) "Authority" means the Central Adoption Resource Authority constituted under section 68;</w:t>
+              <w:br/>
+              <w:t>(8) "begging" means---</w:t>
+              <w:br/>
+              <w:t>(i) soliciting or receiving alms in a public place or entering into any private premises for the purpose of soliciting or receiving alms, under any pretence;</w:t>
+              <w:br/>
+              <w:t>(ii) exposing or exhibiting with the object of obtaining or extorting alms, any sore, wound, injury, deformity or disease, whether of himself or of any other person or of an animal;</w:t>
+              <w:br/>
+              <w:t>(9) "best interest of child" means the basis for any decision taken regarding the child, to ensure fulfilment of his basic rights and needs, identity, social well-being and physical, emotional and intellectual development;</w:t>
+              <w:br/>
+              <w:t>(10) "Board" means a Juvenile Justice Board constituted under section 4;</w:t>
+              <w:br/>
+              <w:t>(11) "Central Authority" means the Government department recognised as such under the Hague Convention on Protection of Children and Cooperation in Inter-country Adoption (1993);</w:t>
+              <w:br/>
+              <w:t>(12) "child" means a person who has not completed eighteen years of age;</w:t>
+              <w:br/>
+              <w:t>(13) "child" in conflict with law means a child who is alleged or found to have committed an offence and who has not completed eighteen years of age on the date of commission of such offence;</w:t>
+              <w:br/>
+              <w:t>(14) "child in need of care and protection" means a child---</w:t>
+              <w:br/>
+              <w:t>(i) who is found without any home or settled place of abode and without any ostensible means of subsistence; or</w:t>
+              <w:br/>
+              <w:t>(ii) who is found working in contravention of [the provisions of this Act or] labour laws for the time being in force or is found begging, or living on the street; or</w:t>
+              <w:br/>
+              <w:t>(iii) who resides with a person (whether a guardian of the child or not) and such person---</w:t>
+              <w:br/>
+              <w:t>(a) has injured, exploited, abused or neglected the child or has violated any other law for the time being in force meant for the protection of child; or</w:t>
+              <w:br/>
+              <w:t>(b) has threatened to kill, injure, exploit or abuse the child and there is a reasonable likelihood of the threat being carried out; or</w:t>
+              <w:br/>
+              <w:t>(c) has killed, abused, neglected or exploited some other child or children and there is a reasonable likelihood of the child in question being killed, abused, exploited or neglected by that person; or</w:t>
+              <w:br/>
+              <w:t>(iv) who is mentally ill or mentally or physically challenged or suffering from terminal or incurable disease, having no one to support or look after or having parents or guardians unfit to take care, if found so by the Board or the Committee; or</w:t>
+              <w:br/>
+              <w:t>(v) who has a parent or guardian and such parent or guardian is found to be unfit or incapacitated, by the Committee or the Board, to care for and protect the safety and well-being of the child; or</w:t>
+              <w:br/>
+              <w:t>[(vi) who does not have parents and no one is willing to take care of and protect or who is abandoned or surrendered;]</w:t>
+              <w:br/>
+              <w:t>(vii) who is missing or run away child, or whose parents cannot be found after making reasonable inquiry in such manner as may be prescribed; or</w:t>
+              <w:br/>
+              <w:t>(viii) who has been or is being or is likely to be abused, tortured or exploited for the purpose of sexual abuse or illegal acts; or</w:t>
+              <w:br/>
+              <w:t>(ix) who is found vulnerable and [has been or is being or is likely to be] inducted into drug abuse or trafficking; or</w:t>
+              <w:br/>
+              <w:t>(x) who is being or is likely to be abused for unconscionable gains; or</w:t>
+              <w:br/>
+              <w:t>(xi) who is victim of or affected by any armed conflict, civil unrest or natural calamity; or</w:t>
+              <w:br/>
+              <w:t>(xii) who is at imminent risk of marriage before attaining the age of marriage and whose parents, family members, guardian and any other persons are likely to be responsible for solemnisation of such marriage;</w:t>
+              <w:br/>
+              <w:t>(15) "child friendly" means any behaviour, conduct, practice, process, attitude, environment or treatment that is humane, considerate and in the best interest of the child;</w:t>
+              <w:br/>
+              <w:t>(16) "child legally free for adoption" means a child declared as such by the Committee after making due inquiry under section 38;</w:t>
+              <w:br/>
+              <w:t>(17) "Child Welfare Officer" means an officer attached to a [child care institution], for carrying out the directions given by the Committee or, as the case may be, the Board with such responsibility as may be prescribed;</w:t>
+              <w:br/>
+              <w:t>(18) "Child Welfare Police Officer" means an officer designated as such under sub-section (1) of section 107;</w:t>
+              <w:br/>
+              <w:t>(19) "Children's Home" means a Children's Home, established or maintained, in every district or group of districts, by the State Government, either by itself, or through a voluntary or non-governmental organisation, and is registered as such for the purposes specified in section 50;</w:t>
+              <w:br/>
+              <w:t>(20) "Children's Court" means a court established under the Commissions for Protection of Child Rights Act, 2005 (4 of 2006) or a Special Court under the Protection of Children from Sexual Offences Act, 2012 (32 of 2012), wherever existing and where such courts have not been designated, the Court of Sessions having jurisdiction to try offences under the Act;</w:t>
+              <w:br/>
+              <w:t>(21) "child care institution" means Children Home, open shelter, observation home, special home, place of safety, Specialised Adoption Agency and a fit facility recognised under this Act for providing care and protection to children, who are in need of such services;</w:t>
+              <w:br/>
+              <w:t>(22) "Committee" means Child Welfare Committee constituted under section 27;</w:t>
+              <w:br/>
+              <w:t>(23) "court" means a civil court, which has jurisdiction in matters of adoption and guardianship and may include the District Court, Family Court and City Civil Courts;</w:t>
+              <w:br/>
+              <w:t>(24) "corporal punishment" means the subjecting of a child by any person to physical punishment that involves the deliberate infliction of pain as retribution for an offence, or for the purpose of disciplining or reforming the child;</w:t>
+              <w:br/>
+              <w:t>(25) "childline services" means a twenty-four hours emergency outreach service for children in crisis which links them to emergency or long-term care and rehabilitation service;</w:t>
+              <w:br/>
+              <w:t>(26) "District Child Protection Unit" means a Child Protection Unit for a District, established by the State Government under section 106, [which shall function under the supervision of the District Magistrate] to ensure the implementation of this Act and other child protection measures in the district;</w:t>
+              <w:br/>
+              <w:t>[(26-A) "District Magistrate" includes Additional District Magistrate of the District;]</w:t>
+              <w:br/>
+              <w:t>(27) "fit facility" means a facility being run by a governmental organisation or a registered voluntary or non-governmental organisation, prepared to temporarily own the responsibility of a particular child for a specific purpose, and such facility is recognised as fit for the said purpose, by the Committee, as the case may be, or the Board, under sub-section (1) of section 51;</w:t>
+              <w:br/>
+              <w:t>(28) "fit person" means any person, prepared to own the responsibility of a child, for a specific purpose, and such person is identified after inquiry made in this behalf and recognised as fit for the said purpose, by the Committee or, as the case may be, the Board, to receive and take care of the child;</w:t>
+              <w:br/>
+              <w:t>(29) "foster care" means placement of a child, by the Committee for the purpose of alternate care in the domestic environment of a family, other than the child's biological family, that has been selected, qualified, approved and supervised for providing such care;</w:t>
+              <w:br/>
+              <w:t>(30) "foster family" means a family found suitable by the District Child Protection Unit to keep children in foster care under section 44;</w:t>
+              <w:br/>
+              <w:t>(31) "guardian" in relation to a child, means his natural guardian or any other person having, in the opinion of the Committee or, as the case may be, the Board, the actual charge of the child, and recognised by the Committee or, as the case may be, the Board as a guardian in the course of proceedings;</w:t>
+              <w:br/>
+              <w:t>(32) "group foster care" means a family like care facility for children in need of care and protection who are without parental care, aiming on providing personalised care and fostering a sense of belonging and identity, through family like and community based solutions;</w:t>
+              <w:br/>
+              <w:t>(33) "heinous offences" includes the offences for which the minimum punishment under the Indian Penal Code (45 of 1860) or any other law for the time being in force is imprisonment for seven years or more;</w:t>
+              <w:br/>
+              <w:t>(34) "inter-country adoption" means adoption of a child from India by non-resident Indian or by a person of Indian origin or by a foreigner;</w:t>
+              <w:br/>
+              <w:t>(35) "juvenile" means a child below the age of eighteen years;</w:t>
+              <w:br/>
+              <w:t>(36) "narcotic drug" and "psychotropic substance" shall have the meanings, respectively, assigned to them in the Narcotic Drugs and Psychotropic Substances Act, 1985 (61 of 1985);</w:t>
+              <w:br/>
+              <w:t>(37) "no objection certificate" for inter-country adoption means a certificate issued by the Central Adoption Resource Authority for the said purpose;</w:t>
+              <w:br/>
+              <w:t>(38) "non-resident Indian" means a person who holds an Indian passport and is presently residing abroad for more than one year;</w:t>
+              <w:br/>
+              <w:t>(39) "notification" means the notification published in the Official Gazette of India, or as the case may be, in the Gazette of a State, and the expression notify shall be construed accordingly;</w:t>
+              <w:br/>
+              <w:t>(40) "observation home" means an observation home established and maintained in every district or group of districts by a State Government, either by itself, or through a voluntary or non-governmental organisation, and is registered as such, for the purposes specified in sub-section (1) of section 47;</w:t>
+              <w:br/>
+              <w:t>(41) "open shelter" means a facility for children, established and maintained by the State Government, either by itself, or through a voluntary or non-governmental organisation under sub-section (1) of section 43, and registered as such, for the purposes specified in that section;</w:t>
+              <w:br/>
+              <w:t>(42) "orphan" means a child---</w:t>
+              <w:br/>
+              <w:t>(i) who is without biological or adoptive parents or legal guardian; or</w:t>
+              <w:br/>
+              <w:t>(ii) whose legal guardian is not willing to take, or capable of taking care of the child;</w:t>
+              <w:br/>
+              <w:t>(43) "overseas citizen of India" means a person registered as such under the Citizenship Act, 1955 (57 of 1955);</w:t>
+              <w:br/>
+              <w:t>(44) "person of Indian origin" means a person, any of whose lineal ancestors is or was an Indian national, and who is presently holding a Person of Indian Origin Card issued by the Central Government;</w:t>
+              <w:br/>
+              <w:t>(45) "petty offences" includes the offences for which the maximum punishment under the Indian Penal Code (45 of 1860) or any other law for the time being in force is imprisonment up to three years;</w:t>
+              <w:br/>
+              <w:t>(46) "place of safety" means any place or institution, not being a police lockup or jail, established separately or attached to an observation home or a special home, as the case may be, [***] to receive and take care of the children alleged or found to be in conflict with law, by an order of the Board or the Children's Court, both during inquiry and ongoing rehabilitation after having been found guilty for a period and purpose as specified in the order;</w:t>
+              <w:br/>
+              <w:t>(47) "prescribed" means prescribed by rules made under this Act;</w:t>
+              <w:br/>
+              <w:t>(48) "probation officer" means an officer appointed by the State Government as a probation officer under the Probation of Offenders Act, 1958 (20 of 1958) or the Legal-cum-Probation Officer appointed by the State Government under District Child Protection Unit;</w:t>
+              <w:br/>
+              <w:t>(49) "prospective adoptive parents" means a person or persons eligible to adopt a child as per the provisions of section 57;</w:t>
+              <w:br/>
+              <w:t>(50) "public place" shall have the same meaning assigned to it in the Immoral Traffic (Prevention) Act, 1956 (104 of 1956);</w:t>
+              <w:br/>
+              <w:t>(51) "registered", with reference to child care institutions or agencies or facilities managed by the State Government, or a voluntary or non-governmental organisation, means observation homes, special homes, place of safety, children's homes, open shelters or Specialised Adoption Agency or fit facility or any other institution that may come up in response to a particular need or agencies or facilities authorised and registered under section 41, for providing residential care to children, on a short-term or long-term basis;</w:t>
+              <w:br/>
+              <w:t>(52) "relative", in relation to a child for the purpose of adoption under this Act, means a paternal uncle or aunt, or a maternal uncle or aunt, or paternal grandparent or maternal grandparent;</w:t>
+              <w:br/>
+              <w:t>(53) "State Agency" means the State Adoption Resource Agency set up by the State Government for dealing with adoption and related matters under section 67;</w:t>
+              <w:br/>
+              <w:t>[(54) "serious offences" includes the offences for which the punishment under the Indian Penal Code (45 of 1860) or any other law for the time being in force, is,---</w:t>
+              <w:br/>
+              <w:t>(a) minimum imprisonment for a term more than three years and not exceeding seven years; or</w:t>
+              <w:br/>
+              <w:t>(b) maximum imprisonment for a term more than seven years but no minimum imprisonment or minimum imprisonment of less than seven years is provided.]</w:t>
+              <w:br/>
+              <w:t>(55) "special juvenile police unit" means a unit of the police force of a district or city or, as the case may be, any other police unit like railway police, dealing with children and designated as such for handling children under section 107;</w:t>
+              <w:br/>
+              <w:t>(56) "special home" means an institution established by a State Government or by a voluntary or non-governmental organisation, registered under section 48, for housing and providing rehabilitative services to children in conflict with law, who are found, through inquiry, to have committed an offence and are sent to such institution by an order of the Board;</w:t>
+              <w:br/>
+              <w:t>(57) "Specialised Adoption Agency" means an institution established by the State Government or by a voluntary or non-governmental organisation and recognised under section 65, for housing orphans, abandoned and surrendered children, placed there by order of the Committee, for the purpose of adoption;</w:t>
+              <w:br/>
+              <w:t>(58) "sponsorship" means provision of supplementary support, financial or otherwise, to the families to meet the medical, educational and developmental needs of the child;</w:t>
+              <w:br/>
+              <w:t>(59) "State Government", in relation to a Union territory, means the Administrator of that Union territory appointed by the President under article 239 of the Constitution;</w:t>
+              <w:br/>
+              <w:t>(60) "surrendered child" means a child, who is relinquished by the parent or guardian to the Committee, on account of physical, emotional and social factors beyond their control, and declared as such by the Committee;</w:t>
+              <w:br/>
+              <w:t>(61) all words and expressions used but not defined in this Act and defined in other Acts shall have the meanings respectively assigned to them in those Acts.</w:t>
+            </w:r>
+          </w:p>
+          <w:p>
+            <w:r>
+              <w:rPr>
+                <w:i/>
+                <w:color w:val="555555"/>
+                <w:sz w:val="13"/>
+              </w:rPr>
+              <w:t>Amendment notes India Code prints: 1. Clause 4 omitted by Act 23 of 2021 s. 2 (w.e.f. 1-9-2022). 2. Ins. by s. 2, ibid., (w.e.f. 1-9-2022). 3. Subs. by s. 2, ibid., for sub-clause (vi) (w.e.f. 1-9-2022). 4. Subs. by s. 2, ibid., for "is likely to be" (w.e.f. 1-9-2022). 5. Subs. by s. 2,ibid., for "Children's Home" (w.e.f. 1-9-2022). 6. Subs. by s. 2, ibid., for "which is the focal point" (w.e.f. 1-9-2022). 7. Ins. by s. 2, ibid., (w.e.f. 1-9-2022). 8. The words "the person in-charge of which is willing" omitted by, s. 2 ibid., (w.e.f. 1-9-2022). 9. Subs. by s. 2, ibid., for clause (54) (w.e.f. 1-9-2022).</w:t>
+            </w:r>
+          </w:p>
+        </w:tc>
+        <w:tc>
+          <w:tcPr>
+            <w:tcW w:type="dxa" w:w="2948"/>
+          </w:tcPr>
+          <w:p>
+            <w:r/>
+            <w:r>
+              <w:rPr>
+                <w:b w:val="0"/>
+                <w:i w:val="0"/>
+                <w:sz w:val="14"/>
+              </w:rPr>
+            </w:r>
+          </w:p>
+        </w:tc>
+      </w:tr>
+      <w:tr>
+        <w:tc>
+          <w:tcPr>
+            <w:tcW w:type="dxa" w:w="850"/>
+          </w:tcPr>
+          <w:p>
+            <w:r/>
+            <w:r>
+              <w:rPr>
+                <w:b/>
+                <w:i w:val="0"/>
+                <w:sz w:val="16"/>
+              </w:rPr>
+              <w:t>s.3</w:t>
+            </w:r>
+          </w:p>
+        </w:tc>
+        <w:tc>
+          <w:tcPr>
+            <w:tcW w:type="dxa" w:w="2268"/>
+          </w:tcPr>
+          <w:p>
+            <w:r/>
+            <w:r>
+              <w:rPr>
+                <w:b w:val="0"/>
+                <w:i/>
+                <w:color w:val="555555"/>
+                <w:sz w:val="14"/>
+              </w:rPr>
+              <w:t>the general principles to be followed in administering the Act (J16)</w:t>
+            </w:r>
+          </w:p>
+        </w:tc>
+        <w:tc>
+          <w:tcPr>
+            <w:tcW w:type="dxa" w:w="8787"/>
+          </w:tcPr>
+          <w:p>
+            <w:r/>
+            <w:r>
+              <w:rPr>
+                <w:b w:val="0"/>
+                <w:i w:val="0"/>
+                <w:sz w:val="14"/>
+              </w:rPr>
+              <w:t>3. General principles to be followed in administration of Act.</w:t>
+              <w:br/>
+              <w:t>The Central Government, the State Governments, [the Board, the Committee, or] other agencies, as the case may be, while implementing the provisions of this Act shall be guided by the following fundamental principles, namely:---</w:t>
+              <w:br/>
+              <w:t>(i) Principle of presumption of innocence: Any child shall be presumed to be an innocent of any mala fide or criminal intent up to the age of eighteen years.</w:t>
+              <w:br/>
+              <w:t>(ii) Principle of dignity and worth: All human beings shall be treated with equal dignity and rights.</w:t>
+              <w:br/>
+              <w:t>(iii) Principle of participation: Every child shall have a right to be heard and to participate in all processes and decisions affecting his interest and the child's views shall be taken into consideration with due regard to the age and maturity of the child.</w:t>
+              <w:br/>
+              <w:t>(iv) Principle of best interest: All decisions regarding the child shall be based on the primary consideration that they are in the best interest of the child and to help the child to develop full potential.</w:t>
+              <w:br/>
+              <w:t>(v) Principle of family responsibility: The primary responsibility of care, nurture and protection of the child shall be that of the biological family or adoptive or foster parents, as the case may be.</w:t>
+              <w:br/>
+              <w:t>(vi) Principle of safety: All measures shall be taken to ensure that the child is safe and is not subjected to any harm, abuse or maltreatment while in contact with the care and protection system, and thereafter.</w:t>
+              <w:br/>
+              <w:t>(vii) Positive measures: All resources are to be mobilised including those of family and community, for promoting the well-being, facilitating development of identity and providing an inclusive and enabling environment, to reduce vulnerabilities of children and the need for intervention under this Act.</w:t>
+              <w:br/>
+              <w:t>(viii) Principle of non-stigmatising semantics: Adversarial or accusatory words are not to be used in the processes pertaining to a child.</w:t>
+              <w:br/>
+              <w:t>(ix) Principle of non-waiver of rights: No waiver of any of the right of the child is permissible or valid, whether sought by the child or person acting on behalf of the child, or a Board or a Committee and any non-exercise of a fundamental right shall not amount to waiver.</w:t>
+              <w:br/>
+              <w:t>(x) Principle of equality and non-discrimination: There shall be no discrimination against a child on any grounds including sex, caste, ethnicity, place of birth, disability and equality of access, opportunity and treatment shall be provided to every child.</w:t>
+              <w:br/>
+              <w:t>(xi) Principle of right to privacy and confidentiality: Every child shall have a right to protection of his privacy and confidentiality, by all means and throughout the judicial process.</w:t>
+              <w:br/>
+              <w:t>(xii) Principle of institutionalisation as a measure of last resort: A child shall be placed in institutional care as a step of last resort after making a reasonable inquiry.</w:t>
+              <w:br/>
+              <w:t>(xiii) Principle of repatriation and restoration: Every child in the juvenile justice system shall have the right to be re-united with his family at the earliest and to be restored to the same socio-economic and cultural status that he was in, before coming under the purview of this Act, unless such restoration and repatriation is not in his best interest.</w:t>
+              <w:br/>
+              <w:t>(xiv) Principle of fresh start: All past records of any child under the Juvenile Justice system should be erased except in special circumstances..</w:t>
+              <w:br/>
+              <w:t>(xv) Principle of diversion: Measures for dealing with children in conflict with law without resorting to judicial proceedings shall be promoted unless it is in the best interest of the child or the society as a whole.</w:t>
+              <w:br/>
+              <w:t>(xvi) Principles of natural justice: Basic procedural standards of fairness shall be adhered to, including the right to a fair hearing, rule against bias and the right to review, by all persons or bodies, acting in a judicial capacity under this Act.</w:t>
+            </w:r>
+          </w:p>
+          <w:p>
+            <w:r>
+              <w:rPr>
+                <w:i/>
+                <w:color w:val="555555"/>
+                <w:sz w:val="13"/>
+              </w:rPr>
+              <w:t>Amendment notes India Code prints: 1. Subs. by Act 23 of 2021, s. 3, for "the Board, and" (w.e.f. 1-9-2022).</w:t>
+            </w:r>
+          </w:p>
+        </w:tc>
+        <w:tc>
+          <w:tcPr>
+            <w:tcW w:type="dxa" w:w="2948"/>
+          </w:tcPr>
+          <w:p>
+            <w:r/>
+            <w:r>
+              <w:rPr>
+                <w:b w:val="0"/>
+                <w:i w:val="0"/>
+                <w:sz w:val="14"/>
+              </w:rPr>
+            </w:r>
+          </w:p>
+        </w:tc>
+      </w:tr>
+      <w:tr>
+        <w:tc>
+          <w:tcPr>
+            <w:tcW w:type="dxa" w:w="850"/>
+          </w:tcPr>
+          <w:p>
+            <w:r/>
+            <w:r>
+              <w:rPr>
+                <w:b/>
+                <w:i w:val="0"/>
+                <w:sz w:val="16"/>
+              </w:rPr>
+              <w:t>s.8</w:t>
+            </w:r>
+          </w:p>
+        </w:tc>
+        <w:tc>
+          <w:tcPr>
+            <w:tcW w:type="dxa" w:w="2268"/>
+          </w:tcPr>
+          <w:p>
+            <w:r/>
+            <w:r>
+              <w:rPr>
+                <w:b w:val="0"/>
+                <w:i/>
+                <w:color w:val="555555"/>
+                <w:sz w:val="14"/>
+              </w:rPr>
+              <w:t>powers, functions and responsibilities of the Juvenile Justice Board (J04)</w:t>
+            </w:r>
+          </w:p>
+        </w:tc>
+        <w:tc>
+          <w:tcPr>
+            <w:tcW w:type="dxa" w:w="8787"/>
+          </w:tcPr>
+          <w:p>
+            <w:r/>
+            <w:r>
+              <w:rPr>
+                <w:b w:val="0"/>
+                <w:i w:val="0"/>
+                <w:sz w:val="14"/>
+              </w:rPr>
+              <w:t>8. Powers, functions and responsibilities of the Board.</w:t>
+              <w:br/>
+              <w:t>(1) Notwithstanding anything contained in any other law for the time being in force but save as otherwise expressly provided in this Act, the Board constituted for any district shall have the power to deal exclusively with all the proceedings under this Act, relating to children in conflict with law, in the area of jurisdiction of such Board.</w:t>
+              <w:br/>
+              <w:t>(2) The powers conferred on the Board by or under this Act may also be exercised by the High Court and the Children's Court, when the proceedings come before them under section 19 or in appeal, revision or otherwise.</w:t>
+              <w:br/>
+              <w:t>(3) The functions and responsibilities of the Board shall include--</w:t>
+              <w:br/>
+              <w:t>(a) ensuring the informed participation of the child and the parent or guardian, in every step of the process;</w:t>
+              <w:br/>
+              <w:t>(b) ensuring that the child's rights are protected throughout the process of apprehending the child, inquiry, aftercare and rehabilitation;</w:t>
+              <w:br/>
+              <w:t>(c) ensuring availability of legal aid for the child through the legal services institutions;</w:t>
+              <w:br/>
+              <w:t>(d) wherever necessary the Board shall provide an interpreter or translator, having such qualifications, experience, and on payment of such fees as may be prescribed, to the child if he fails to understand the language used in the proceedings;</w:t>
+              <w:br/>
+              <w:t>(e) directing the Probation Officer, or in case a Probation Officer is not available to the Child Welfare Officer or a social worker, to undertake a social investigation into the case and submit a social investigation report within a period of fifteen days from the date of first production before the Board to ascertain the circumstances in which the alleged offence was committed;</w:t>
+              <w:br/>
+              <w:t>(f) adjudicate and dispose of cases of children in conflict with law in accordance with the process of inquiry specified in section 14;</w:t>
+              <w:br/>
+              <w:t>(g) transferring to the Committee, matters concerning the child alleged to be in conflict with law, stated to be in need of care and protection at any stage, thereby recognising that a child in conflict with law can also be a child in need of care simultaneously and there is a need for the Committee and the Board to be both involved;</w:t>
+              <w:br/>
+              <w:t>(h) disposing of the matter and passing a final order that includes an individual care plan for the child's rehabilitation, including follow up by the Probation Officer or the District Child Protection Unit or a member of a non-governmental organisation, as may be required;</w:t>
+              <w:br/>
+              <w:t>(i) conducting inquiry for declaring fit persons regarding care of children in conflict with law;</w:t>
+              <w:br/>
+              <w:t>(j) conducting at least one inspection visit every month of residential facilities for children in conflict with law and recommend action for improvement in quality of services to the District Child Protection Unit and the State Government;</w:t>
+              <w:br/>
+              <w:t>(k) order the police for registration of first information report for offences committed against any child in conflict with law, under this Act or any other law for the time being in force, on a complaint made in this regard;</w:t>
+              <w:br/>
+              <w:t>(l) order the police for registration of first information report for offences committed against any child in need of care and protection, under this Act or any other law for the time being in force, on a written complaint by a Committee in this regard;</w:t>
+              <w:br/>
+              <w:t>(m) conducting regular inspection of jails meant for adults to check if any child is lodged in such jails and take immediate measures for transfer of [that child to an observation home or place of safety, as the case may be]; and</w:t>
+              <w:br/>
+              <w:t>(n) any other function as may be prescribed.</w:t>
+            </w:r>
+          </w:p>
+          <w:p>
+            <w:r>
+              <w:rPr>
+                <w:i/>
+                <w:color w:val="555555"/>
+                <w:sz w:val="13"/>
+              </w:rPr>
+              <w:t>Amendment notes India Code prints: 1. Subs. by Act 23 of 2021, s. 5, for "of such a child to the observation home" (w.e.f. 1-9-2022).</w:t>
+            </w:r>
+          </w:p>
+        </w:tc>
+        <w:tc>
+          <w:tcPr>
+            <w:tcW w:type="dxa" w:w="2948"/>
+          </w:tcPr>
+          <w:p>
+            <w:r/>
+            <w:r>
+              <w:rPr>
+                <w:b w:val="0"/>
+                <w:i w:val="0"/>
+                <w:sz w:val="14"/>
+              </w:rPr>
+            </w:r>
+          </w:p>
+        </w:tc>
+      </w:tr>
+      <w:tr>
+        <w:tc>
+          <w:tcPr>
+            <w:tcW w:type="dxa" w:w="850"/>
+          </w:tcPr>
+          <w:p>
+            <w:r/>
+            <w:r>
+              <w:rPr>
+                <w:b/>
+                <w:i w:val="0"/>
+                <w:sz w:val="16"/>
+              </w:rPr>
+              <w:t>s.12</w:t>
+            </w:r>
+          </w:p>
+        </w:tc>
+        <w:tc>
+          <w:tcPr>
+            <w:tcW w:type="dxa" w:w="2268"/>
+          </w:tcPr>
+          <w:p>
+            <w:r/>
+            <w:r>
+              <w:rPr>
+                <w:b w:val="0"/>
+                <w:i/>
+                <w:color w:val="555555"/>
+                <w:sz w:val="14"/>
+              </w:rPr>
+              <w:t>bail to a person who is apparently a child in conflict with law (J03)</w:t>
+            </w:r>
+          </w:p>
+        </w:tc>
+        <w:tc>
+          <w:tcPr>
+            <w:tcW w:type="dxa" w:w="8787"/>
+          </w:tcPr>
+          <w:p>
+            <w:r/>
+            <w:r>
+              <w:rPr>
+                <w:b w:val="0"/>
+                <w:i w:val="0"/>
+                <w:sz w:val="14"/>
+              </w:rPr>
+              <w:t>12. Bail to a person who is apparently a child alleged to be in conflict with law.</w:t>
+              <w:br/>
+              <w:t>(1) When any person, who is apparently a child and is alleged to have committed a abailable or non-bailable offence, is apprehended or detained by the police or appears or brought before a Board, such person shall, notwithstanding anything contained in the Code of Criminal Procedure, 1973 (2 of 1974) or in any other law for the time being in force, be released on bail with or without surety or placed under the supervision of a probation officer or under the care of any fit person:</w:t>
+              <w:br/>
+              <w:t>Provided that such person shall not be so released if there appears reasonable grounds for believing that the release is likely to bring that person into association with any known criminal or expose the said person to moral, physical or psychological danger or the person's release would defeat the ends of justice, and the Board shall record the reasons for denying the bail and circumstances that led to such a decision.</w:t>
+              <w:br/>
+              <w:t>(2) When such person having been apprehended is not released on bail under sub-section (1) by the officer-in-charge of the police station, such officer shall cause the person to be kept only in an observation home [or a place of safety, as the case may be] in such manner as may be prescribed until the person can be brought before a Board.</w:t>
+              <w:br/>
+              <w:t>(3) When such person is not released on bail under sub-section (1) by the Board, it shall make an order sending him to an observation home or a place of safety, as the case may be, for such period during the pendency of the inquiry regarding the person, as may be specified in the order.</w:t>
+              <w:br/>
+              <w:t>(4) When a child in conflict with law is unable to fulfil the conditions of bail order within seven days of the bail order, such child shall be produced before the Board for modification of the conditions of bail.</w:t>
+            </w:r>
+          </w:p>
+          <w:p>
+            <w:r>
+              <w:rPr>
+                <w:i/>
+                <w:color w:val="555555"/>
+                <w:sz w:val="13"/>
+              </w:rPr>
+              <w:t>Amendment notes India Code prints: 1. Ins. by Act 23 of 2021, s. 6 (w.e.f. 1-9-2022).</w:t>
+            </w:r>
+          </w:p>
+        </w:tc>
+        <w:tc>
+          <w:tcPr>
+            <w:tcW w:type="dxa" w:w="2948"/>
+          </w:tcPr>
+          <w:p>
+            <w:r/>
+            <w:r>
+              <w:rPr>
+                <w:b w:val="0"/>
+                <w:i w:val="0"/>
+                <w:sz w:val="14"/>
+              </w:rPr>
+            </w:r>
+          </w:p>
+        </w:tc>
+      </w:tr>
+      <w:tr>
+        <w:tc>
+          <w:tcPr>
+            <w:tcW w:type="dxa" w:w="850"/>
+          </w:tcPr>
+          <w:p>
+            <w:r/>
+            <w:r>
+              <w:rPr>
+                <w:b/>
+                <w:i w:val="0"/>
+                <w:sz w:val="16"/>
+              </w:rPr>
+              <w:t>s.15</w:t>
+            </w:r>
+          </w:p>
+        </w:tc>
+        <w:tc>
+          <w:tcPr>
+            <w:tcW w:type="dxa" w:w="2268"/>
+          </w:tcPr>
+          <w:p>
+            <w:r/>
+            <w:r>
+              <w:rPr>
+                <w:b w:val="0"/>
+                <w:i/>
+                <w:color w:val="555555"/>
+                <w:sz w:val="14"/>
+              </w:rPr>
+              <w:t>preliminary assessment into a heinous offence: when a child of 16+ may be tried as an adult (J01, J02)</w:t>
+            </w:r>
+          </w:p>
+        </w:tc>
+        <w:tc>
+          <w:tcPr>
+            <w:tcW w:type="dxa" w:w="8787"/>
+          </w:tcPr>
+          <w:p>
+            <w:r/>
+            <w:r>
+              <w:rPr>
+                <w:b w:val="0"/>
+                <w:i w:val="0"/>
+                <w:sz w:val="14"/>
+              </w:rPr>
+              <w:t>15. Preliminary assessment into heinous offences by Board.</w:t>
+              <w:br/>
+              <w:t>(1) In case of a heinous offence alleged to have been committed by a child, who has completed or is above the age of sixteen years, the Board shall conduct a preliminary assessment with regard to his mental and physical capacity to commit such offence, ability to understand the consequences of the offence and the circumstances in which he allegedly committed the offence, and may pass an order in accordance with the provisions of sub-section (3) of section 18:</w:t>
+              <w:br/>
+              <w:t>Provided that for such an assessment, the Board may take the assistance of experienced psychologists or psycho-social workers or other experts.</w:t>
+              <w:br/>
+              <w:t>Explanation.—For the purposes of this section, it is clarified that preliminary assessment is not a trial, but is to assess the capacity of such child to commit and understand the consequences of the alleged offence.</w:t>
+              <w:br/>
+              <w:t>(2) Where the Board is satisfied on preliminary assessment that the matter should be disposed of by the Board, then the Board shall follow the procedure, as far as may be, for trial in summons case under the Code of Criminal Procedure, 1973 (2 of 1974):</w:t>
+              <w:br/>
+              <w:t>Provided that the order of the Board to dispose of the matter shall be appealable under sub-section (2) of section 101:</w:t>
+              <w:br/>
+              <w:t>Provided further that the assessment under this section shall be completed within the period specified in section 14.</w:t>
+            </w:r>
+          </w:p>
+        </w:tc>
+        <w:tc>
+          <w:tcPr>
+            <w:tcW w:type="dxa" w:w="2948"/>
+          </w:tcPr>
+          <w:p>
+            <w:r/>
+            <w:r>
+              <w:rPr>
+                <w:b w:val="0"/>
+                <w:i w:val="0"/>
+                <w:sz w:val="14"/>
+              </w:rPr>
+            </w:r>
+          </w:p>
+        </w:tc>
+      </w:tr>
+      <w:tr>
+        <w:tc>
+          <w:tcPr>
+            <w:tcW w:type="dxa" w:w="850"/>
+          </w:tcPr>
+          <w:p>
+            <w:r/>
+            <w:r>
+              <w:rPr>
+                <w:b/>
+                <w:i w:val="0"/>
+                <w:sz w:val="16"/>
+              </w:rPr>
+              <w:t>s.27</w:t>
+            </w:r>
+          </w:p>
+        </w:tc>
+        <w:tc>
+          <w:tcPr>
+            <w:tcW w:type="dxa" w:w="2268"/>
+          </w:tcPr>
+          <w:p>
+            <w:r/>
+            <w:r>
+              <w:rPr>
+                <w:b w:val="0"/>
+                <w:i/>
+                <w:color w:val="555555"/>
+                <w:sz w:val="14"/>
+              </w:rPr>
+              <w:t>Child Welfare Committee: who decides on a child in need of care and protection (J09)</w:t>
+            </w:r>
+          </w:p>
+        </w:tc>
+        <w:tc>
+          <w:tcPr>
+            <w:tcW w:type="dxa" w:w="8787"/>
+          </w:tcPr>
+          <w:p>
+            <w:r/>
+            <w:r>
+              <w:rPr>
+                <w:b w:val="0"/>
+                <w:i w:val="0"/>
+                <w:sz w:val="14"/>
+              </w:rPr>
+              <w:t>27. Child Welfare Committee.</w:t>
+              <w:br/>
+              <w:t>(1) The State Government shall by notification in the Official Gazette constitute for every district, one or more Child Welfare Committees for exercising the powers and to discharge the duties conferred on such Committees in relation to children in need of care and protection under this Act and ensure that induction training and sensitisation of all members of the committee is provided within two months from the date of notification.</w:t>
+              <w:br/>
+              <w:t>(2) The Committee shall consist of a Chairperson, and four other members as the State Government may think fit to appoint, of whom at least one shall be a woman and another, an expert on the matters concerning children.</w:t>
+              <w:br/>
+              <w:t>(3) The District Child Protection Unit shall provide a Secretary and other staff that may be required for secretarial support to the Committee for its effective functioning.</w:t>
+              <w:br/>
+              <w:t>[(4) No person shall be appointed as a member of the Committee unless he has a degree in child psychology or psychiatry or law or social work or sociology or human health or education or human development or special education for differently abled children and has been actively involved in health, education or welfare activities pertaining to children for seven years or is a practicing professional with a degree in child psychology or psychiatry or law or social work or sociology or human health or education or human development or special education for differently abled children.</w:t>
+              <w:br/>
+              <w:t>(4A) No person shall be eligible for selection as a member of the Committee, if he--</w:t>
+              <w:br/>
+              <w:t>(i) has any past record of violation of human rights or child rights,</w:t>
+              <w:br/>
+              <w:t>(ii) has been convicted of an offence involving moral turpitude, and such conviction has not been reversed or has not been granted full pardon in respect of such offence,</w:t>
+              <w:br/>
+              <w:t>(iii) has been removed or dismissed from service of the Government of India or State Government or an undertaking or corporation owned or controlled by the Government of India or State Government,</w:t>
+              <w:br/>
+              <w:t>(iv) has ever indulged in child abuse or employment of child labour or immoral act or any other violation of human rights or immoral acts, or</w:t>
+              <w:br/>
+              <w:t>(v) is part of management of a child care institution in a District.]</w:t>
+              <w:br/>
+              <w:t>(5) No person shall be appointed as a member unless he possesses such other qualifications as may be prescribed.</w:t>
+              <w:br/>
+              <w:t>(6) No person shall be appointed for a period of more than three years as a member of the Committee.</w:t>
+              <w:br/>
+              <w:t>(7) The appointment of any member of the Committee shall be terminated by the State Government after making an inquiry, if--</w:t>
+              <w:br/>
+              <w:t>(i) he has been found guilty of misuse of power vested on him under this Act;</w:t>
+              <w:br/>
+              <w:t>(ii) he has been convicted of an offence involving moral turpitude and such conviction has not been reversed or he has not been granted full pardon in respect of such offence;</w:t>
+              <w:br/>
+              <w:t>(iii) he fails to attend the proceedings of the Committee consecutively for three months without any valid reason or he fails to attend [minimum] three-fourths of the sittings in a year.</w:t>
+              <w:br/>
+              <w:t>[(8) The Committee shall submit a report to the District Magistrate in such form as may be prescribed and the District Magistrate shall conduct a quarterly review of the functioning of the Committee.]</w:t>
+              <w:br/>
+              <w:t>(9) The Committee shall function as a Bench and shall have the powers conferred by the Code of Criminal Procedure, 1973 (2 of 1974) on a Metropolitan Magistrate or, as the case may be, a Judicial Magistrate of First Class.</w:t>
+              <w:br/>
+              <w:t>[(10) The District Magistrate shall be the grievance redressal authority to entertain any grievance arising out of the functioning of the Committee and the affected child or anyone connected with the child, as the case may be, may file a complaint before the District Magistrate who shall take cognizance of the action of the Committee and, after giving the parties an opportunity of being heard, pass appropriate order.]</w:t>
+            </w:r>
+          </w:p>
+          <w:p>
+            <w:r>
+              <w:rPr>
+                <w:i/>
+                <w:color w:val="555555"/>
+                <w:sz w:val="13"/>
+              </w:rPr>
+              <w:t>Amendment notes India Code prints: 1. Subs. by Act 23 of 2021, s. 9, for sub-section (4) (w.e.f. 1-9-2022). 2. Subs. by Act 23 of 2021, s. 9, for "less than" (w.e.f. 1-9-2022). 3. Subs. by s. 9, ibid., for sub-section (8) (w.e.f. 1-9-2022). 4. Subs. by s. 9, ibid., for sub-section (10) (w.e.f. 1-9-2022).</w:t>
+            </w:r>
+          </w:p>
+        </w:tc>
+        <w:tc>
+          <w:tcPr>
+            <w:tcW w:type="dxa" w:w="2948"/>
+          </w:tcPr>
+          <w:p>
+            <w:r/>
+            <w:r>
+              <w:rPr>
+                <w:b w:val="0"/>
+                <w:i w:val="0"/>
+                <w:sz w:val="14"/>
+              </w:rPr>
+            </w:r>
+          </w:p>
+        </w:tc>
+      </w:tr>
+      <w:tr>
+        <w:tc>
+          <w:tcPr>
+            <w:tcW w:type="dxa" w:w="850"/>
+          </w:tcPr>
+          <w:p>
+            <w:r/>
+            <w:r>
+              <w:rPr>
+                <w:b/>
+                <w:i w:val="0"/>
+                <w:sz w:val="16"/>
+              </w:rPr>
+              <w:t>s.57</w:t>
+            </w:r>
+          </w:p>
+        </w:tc>
+        <w:tc>
+          <w:tcPr>
+            <w:tcW w:type="dxa" w:w="2268"/>
+          </w:tcPr>
+          <w:p>
+            <w:r/>
+            <w:r>
+              <w:rPr>
+                <w:b w:val="0"/>
+                <w:i/>
+                <w:color w:val="555555"/>
+                <w:sz w:val="14"/>
+              </w:rPr>
+              <w:t>eligibility of prospective adoptive parents (J08)</w:t>
+            </w:r>
+          </w:p>
+        </w:tc>
+        <w:tc>
+          <w:tcPr>
+            <w:tcW w:type="dxa" w:w="8787"/>
+          </w:tcPr>
+          <w:p>
+            <w:r/>
+            <w:r>
+              <w:rPr>
+                <w:b w:val="0"/>
+                <w:i w:val="0"/>
+                <w:sz w:val="14"/>
+              </w:rPr>
+              <w:t>57. Eligibility of prospective adoptive parents.</w:t>
+              <w:br/>
+              <w:t>(1) The prospective adoptive parents shall be physically fit, financially sound, mentally alert and highly motivated to adopt a child for providing a good upbringing to him.</w:t>
+              <w:br/>
+              <w:t>(2) In case of a couple, the consent of both the spouses for the adoption shall be required.</w:t>
+              <w:br/>
+              <w:t>(3) A single or divorced person can also adopt, subject to fulfilment of the criteria and in accordance with the provisions of adoption regulations framed by the Authority.</w:t>
+              <w:br/>
+              <w:t>(4) A single male is not eligible to adopt a girl child.</w:t>
+              <w:br/>
+              <w:t>(5) Any other criteria that may be specified in the adoption regulations framed by the Authority.</w:t>
+            </w:r>
+          </w:p>
+        </w:tc>
+        <w:tc>
+          <w:tcPr>
+            <w:tcW w:type="dxa" w:w="2948"/>
+          </w:tcPr>
+          <w:p>
+            <w:r/>
+            <w:r>
+              <w:rPr>
+                <w:b w:val="0"/>
+                <w:i w:val="0"/>
+                <w:sz w:val="14"/>
+              </w:rPr>
+            </w:r>
+          </w:p>
+        </w:tc>
+      </w:tr>
+      <w:tr>
+        <w:tc>
+          <w:tcPr>
+            <w:tcW w:type="dxa" w:w="850"/>
+          </w:tcPr>
+          <w:p>
+            <w:r/>
+            <w:r>
+              <w:rPr>
+                <w:b/>
+                <w:i w:val="0"/>
+                <w:sz w:val="16"/>
+              </w:rPr>
+              <w:t>s.58</w:t>
+            </w:r>
+          </w:p>
+        </w:tc>
+        <w:tc>
+          <w:tcPr>
+            <w:tcW w:type="dxa" w:w="2268"/>
+          </w:tcPr>
+          <w:p>
+            <w:r/>
+            <w:r>
+              <w:rPr>
+                <w:b w:val="0"/>
+                <w:i/>
+                <w:color w:val="555555"/>
+                <w:sz w:val="14"/>
+              </w:rPr>
+              <w:t>procedure for adoption by Indian adoptive parents (J07)</w:t>
+            </w:r>
+          </w:p>
+        </w:tc>
+        <w:tc>
+          <w:tcPr>
+            <w:tcW w:type="dxa" w:w="8787"/>
+          </w:tcPr>
+          <w:p>
+            <w:r/>
+            <w:r>
+              <w:rPr>
+                <w:b w:val="0"/>
+                <w:i w:val="0"/>
+                <w:sz w:val="14"/>
+              </w:rPr>
+              <w:t>58. Procedure for adoption by Indian prospective adoptive parents living in India.</w:t>
+              <w:br/>
+              <w:t>(1) Indian prospective adoptive parents living in India, irrespective of their religion, if interested to adopt an orphan or abandoned or surrendered child, may apply for the same to a Specialised Adoption Agency, in the manner as provided in the adoption regulations framed by the Authority.</w:t>
+              <w:br/>
+              <w:t>(2) The Specialised Adoption Agency shall prepare the home study report of the prospective adoptive parents and upon finding them eligible, will refer a child declared legally free for adoption to them along with the child study report and medical report of the child, in the manner as provided in the adoption regulations framed by the Authority.</w:t>
+              <w:br/>
+              <w:t>(3) On the receipt of the acceptance of the child from the prospective adoptive parents along with the child study report and medical report of the child signed by such parents, the Specialised Adoption Agency shall give the child in pre-adoption foster care and file an application [before the District Magisrate] for obtaining the adoption order, in the manner as provided in the adoption regulations framed by the Authority.</w:t>
+              <w:br/>
+              <w:t>(4) On the receipt of a certified copy of the [order passed by the District Magistrate], the Specialised Adoption Agency shall send immediately the same to the prospective adoptive parents.</w:t>
+              <w:br/>
+              <w:t>(5) The progress and wellbeing of the child in the adoptive family shall be followed up and ascertained in the manner as provided in the adoption regulations framed by the Authority</w:t>
+            </w:r>
+          </w:p>
+          <w:p>
+            <w:r>
+              <w:rPr>
+                <w:i/>
+                <w:color w:val="555555"/>
+                <w:sz w:val="13"/>
+              </w:rPr>
+              <w:t>Amendment notes India Code prints: 1. Subs. by s. 18, ibid., for "in the court" (w.e.f. 1-9-2022). 2. Subs. by s. 18, ibid., for "court order" (w.e.f. 1-9-2022).</w:t>
+            </w:r>
+          </w:p>
+        </w:tc>
+        <w:tc>
+          <w:tcPr>
+            <w:tcW w:type="dxa" w:w="2948"/>
+          </w:tcPr>
+          <w:p>
+            <w:r/>
+            <w:r>
+              <w:rPr>
+                <w:b w:val="0"/>
+                <w:i w:val="0"/>
+                <w:sz w:val="14"/>
+              </w:rPr>
+            </w:r>
+          </w:p>
+        </w:tc>
+      </w:tr>
+      <w:tr>
+        <w:tc>
+          <w:tcPr>
+            <w:tcW w:type="dxa" w:w="850"/>
+          </w:tcPr>
+          <w:p>
+            <w:r/>
+            <w:r>
+              <w:rPr>
+                <w:b/>
+                <w:i w:val="0"/>
+                <w:sz w:val="16"/>
+              </w:rPr>
+              <w:t>s.74</w:t>
+            </w:r>
+          </w:p>
+        </w:tc>
+        <w:tc>
+          <w:tcPr>
+            <w:tcW w:type="dxa" w:w="2268"/>
+          </w:tcPr>
+          <w:p>
+            <w:r/>
+            <w:r>
+              <w:rPr>
+                <w:b w:val="0"/>
+                <w:i/>
+                <w:color w:val="555555"/>
+                <w:sz w:val="14"/>
+              </w:rPr>
+              <w:t>prohibition on disclosing a child's identity (J11)</w:t>
+            </w:r>
+          </w:p>
+        </w:tc>
+        <w:tc>
+          <w:tcPr>
+            <w:tcW w:type="dxa" w:w="8787"/>
+          </w:tcPr>
+          <w:p>
+            <w:r/>
+            <w:r>
+              <w:rPr>
+                <w:b w:val="0"/>
+                <w:i w:val="0"/>
+                <w:sz w:val="14"/>
+              </w:rPr>
+              <w:t>74. Prohibition on disclosure of identity of children.</w:t>
+              <w:br/>
+              <w:t>(1) No report in any newspaper, magazine, news-sheet or audio-visual media or other forms of communication regarding any inquiry or investigation or judicial procedure, shall disclose the name, address or school or any other particular, which may lead to the identification of a child in conflict with law or a child in need of care and protection or a child victim or witness of a crime, involved in such matter, under any other law for the time being in force, nor shall the picture of any such child be published:</w:t>
+              <w:br/>
+              <w:t>Provided that for reasons to be recorded in writing, the Board or Committee, as the case may be, holding the inquiry may permit such disclosure, if in its opinion such disclosure is in the best interest of the child.</w:t>
+              <w:br/>
+              <w:t>(2) The Police shall not disclose any record of the child for the purpose of character certificate or otherwise [in the pending case or in the case which] has been closed or disposed of.</w:t>
+              <w:br/>
+              <w:t>(3) Any person contravening the provisions of sub-section (1) shall be punishable with imprisonment for a term which may extend to six months or fine which may extend to two lakh rupees or both.</w:t>
+            </w:r>
+          </w:p>
+          <w:p>
+            <w:r>
+              <w:rPr>
+                <w:i/>
+                <w:color w:val="555555"/>
+                <w:sz w:val="13"/>
+              </w:rPr>
+              <w:t>Amendment notes India Code prints: 1. Subs. by Act 23 of 2021, s. 25, for "in cases where the case" (w.e.f. 1-9-2022).</w:t>
+            </w:r>
+          </w:p>
+        </w:tc>
+        <w:tc>
+          <w:tcPr>
+            <w:tcW w:type="dxa" w:w="2948"/>
+          </w:tcPr>
+          <w:p>
+            <w:r/>
+            <w:r>
+              <w:rPr>
+                <w:b w:val="0"/>
+                <w:i w:val="0"/>
+                <w:sz w:val="14"/>
+              </w:rPr>
+            </w:r>
+          </w:p>
+        </w:tc>
+      </w:tr>
+      <w:tr>
+        <w:tc>
+          <w:tcPr>
+            <w:tcW w:type="dxa" w:w="850"/>
+          </w:tcPr>
+          <w:p>
+            <w:r/>
+            <w:r>
+              <w:rPr>
+                <w:b/>
+                <w:i w:val="0"/>
+                <w:sz w:val="16"/>
+              </w:rPr>
+              <w:t>s.75</w:t>
+            </w:r>
+          </w:p>
+        </w:tc>
+        <w:tc>
+          <w:tcPr>
+            <w:tcW w:type="dxa" w:w="2268"/>
+          </w:tcPr>
+          <w:p>
+            <w:r/>
+            <w:r>
+              <w:rPr>
+                <w:b w:val="0"/>
+                <w:i/>
+                <w:color w:val="555555"/>
+                <w:sz w:val="14"/>
+              </w:rPr>
+              <w:t>punishment for cruelty to a child (J06)</w:t>
+            </w:r>
+          </w:p>
+        </w:tc>
+        <w:tc>
+          <w:tcPr>
+            <w:tcW w:type="dxa" w:w="8787"/>
+          </w:tcPr>
+          <w:p>
+            <w:r/>
+            <w:r>
+              <w:rPr>
+                <w:b w:val="0"/>
+                <w:i w:val="0"/>
+                <w:sz w:val="14"/>
+              </w:rPr>
+              <w:t>75. Punishment for cruelty to child.</w:t>
+              <w:br/>
+              <w:t>Whoever, having the actual charge of, or control over, a child, assaults, abandons, abuses, exposes or wilfully neglects the child or causes or procures the child to be assaulted, abandoned, abused, exposed or neglected in a manner likely to cause such child unnecessary mental or physical suffering, shall be punishable with imprisonment for a term which may extend to three years or with fine of one lakh rupees or with both:</w:t>
+              <w:br/>
+              <w:t>Provided that in case it is found that such abandonment of the child by the biological parents is due to circumstances beyond their control, it shall be presumed that such abandonment is not wilful and the penal provisions of this section shall not apply in such cases:</w:t>
+              <w:br/>
+              <w:t>Provided further that if such offence is committed by any person employed by or managing an organisation, which is entrusted with the care and protection of the child, he shall be punished with rigorous imprisonment which may extend up to five years, and fine which may extend up to five lakhs rupees:</w:t>
+              <w:br/>
+              <w:t>Provided also that on account of the aforesaid cruelty, if the child is physically incapacitated or develops a mental illness or is rendered mentally unfit to perform regular tasks or has risk to life or limb, such person shall be punishable with rigorous imprisonment, not less than three years but which may be extended up to ten years and shall also be liable to fine of five lakhs rupees.</w:t>
+            </w:r>
+          </w:p>
+        </w:tc>
+        <w:tc>
+          <w:tcPr>
+            <w:tcW w:type="dxa" w:w="2948"/>
+          </w:tcPr>
+          <w:p>
+            <w:r/>
+            <w:r>
+              <w:rPr>
+                <w:b w:val="0"/>
+                <w:i w:val="0"/>
+                <w:sz w:val="14"/>
+              </w:rPr>
+            </w:r>
+          </w:p>
+        </w:tc>
+      </w:tr>
+      <w:tr>
+        <w:tc>
+          <w:tcPr>
+            <w:tcW w:type="dxa" w:w="850"/>
+          </w:tcPr>
+          <w:p>
+            <w:r/>
+            <w:r>
+              <w:rPr>
+                <w:b/>
+                <w:i w:val="0"/>
+                <w:sz w:val="16"/>
+              </w:rPr>
+              <w:t>s.82</w:t>
+            </w:r>
+          </w:p>
+        </w:tc>
+        <w:tc>
+          <w:tcPr>
+            <w:tcW w:type="dxa" w:w="2268"/>
+          </w:tcPr>
+          <w:p>
+            <w:r/>
+            <w:r>
+              <w:rPr>
+                <w:b w:val="0"/>
+                <w:i/>
+                <w:color w:val="555555"/>
+                <w:sz w:val="14"/>
+              </w:rPr>
+              <w:t>corporal punishment (J15)</w:t>
+            </w:r>
+          </w:p>
+        </w:tc>
+        <w:tc>
+          <w:tcPr>
+            <w:tcW w:type="dxa" w:w="8787"/>
+          </w:tcPr>
+          <w:p>
+            <w:r/>
+            <w:r>
+              <w:rPr>
+                <w:b w:val="0"/>
+                <w:i w:val="0"/>
+                <w:sz w:val="14"/>
+              </w:rPr>
+              <w:t>82. Corporal punishment.</w:t>
+              <w:br/>
+              <w:t>(1) Any person in-charge of or employed in a child care institution, who subjects a child to corporal punishment with the aim of disciplining the child, shall be liable, on the first conviction, to a fine of ten thousand rupees and for every subsequent offence, shall be liable for imprisonment which may extend to three months or fine or with both.</w:t>
+              <w:br/>
+              <w:t>(2) If a person employed in an institution referred to in sub-section (1), is convicted of an offence under that sub-section, such person shall also be liable for dismissal from service, and shall also be debarred from working directly with children thereafter.</w:t>
+              <w:br/>
+              <w:t>(3) In case, where any corporal punishment is reported in an institution referred to in sub-section (1) and the management of such institution does not cooperate with any inquiry or comply with the orders of the Committee or the Board or court or State Government, the person in-charge of the management of the institution shall be liable for punishment with imprisonment for a term not less than three years and shall also be liable to fine which may extend to one lakh rupees.</w:t>
+            </w:r>
+          </w:p>
+        </w:tc>
+        <w:tc>
+          <w:tcPr>
+            <w:tcW w:type="dxa" w:w="2948"/>
+          </w:tcPr>
+          <w:p>
+            <w:r/>
+            <w:r>
+              <w:rPr>
+                <w:b w:val="0"/>
+                <w:i w:val="0"/>
+                <w:sz w:val="14"/>
+              </w:rPr>
+            </w:r>
+          </w:p>
+        </w:tc>
+      </w:tr>
+      <w:tr>
+        <w:tc>
+          <w:tcPr>
+            <w:tcW w:type="dxa" w:w="850"/>
+          </w:tcPr>
+          <w:p>
+            <w:r/>
+            <w:r>
+              <w:rPr>
+                <w:b/>
+                <w:i w:val="0"/>
+                <w:sz w:val="16"/>
+              </w:rPr>
+              <w:t>s.94</w:t>
+            </w:r>
+          </w:p>
+        </w:tc>
+        <w:tc>
+          <w:tcPr>
+            <w:tcW w:type="dxa" w:w="2268"/>
+          </w:tcPr>
+          <w:p>
+            <w:r/>
+            <w:r>
+              <w:rPr>
+                <w:b w:val="0"/>
+                <w:i/>
+                <w:color w:val="555555"/>
+                <w:sz w:val="14"/>
+              </w:rPr>
+              <w:t>presumption and determination of age (J18)</w:t>
+            </w:r>
+          </w:p>
+        </w:tc>
+        <w:tc>
+          <w:tcPr>
+            <w:tcW w:type="dxa" w:w="8787"/>
+          </w:tcPr>
+          <w:p>
+            <w:r/>
+            <w:r>
+              <w:rPr>
+                <w:b w:val="0"/>
+                <w:i w:val="0"/>
+                <w:sz w:val="14"/>
+              </w:rPr>
+              <w:t>94. Presumption and determination of age.</w:t>
+              <w:br/>
+              <w:t>(1) Where, it is obvious to the Committee or the Board, based on the appearance of the person brought before it under any of the provisions of this Act (other than for the purpose of giving evidence) that the said person is a child, the Committee or the Board shall record such observation stating the age of the child as nearly as may be and proceed with the inquiry under section 14 or section 36, as the case may be, without waiting for further confirmation of the age.</w:t>
+              <w:br/>
+              <w:t>(2) In case, the Committee or the Board has reasonable grounds for doubt regarding whether the person brought before it is a child or not, the Committee or the Board, as the case may be, shall undertake the process of age determination, by seeking evidence by obtaining—</w:t>
+              <w:br/>
+              <w:t>(i) the date of birth certificate from the school, or the matriculation or equivalent certificate from the concerned examination Board, if available; and in the absence thereof;</w:t>
+              <w:br/>
+              <w:t>(ii) the birth certificate given by a corporation or a municipal authority or a panchayat;</w:t>
+              <w:br/>
+              <w:t>(iii) and only in the absence of (i) and (ii) above, age shall be determined by an ossification test or any other latest medical age determination test conducted on the orders of the Committee or the Board:</w:t>
+              <w:br/>
+              <w:t>Provided such age determination test conducted on the order of the Committee or the Board shall be completed within fifteen days from the date of such order.</w:t>
+              <w:br/>
+              <w:t>(3) The age recorded by the Committee or the Board to be the age of person so brought before it shall, for the purpose of this Act, be deemed to be the true age of that person.</w:t>
+            </w:r>
+          </w:p>
+        </w:tc>
+        <w:tc>
+          <w:tcPr>
+            <w:tcW w:type="dxa" w:w="2948"/>
+          </w:tcPr>
+          <w:p>
+            <w:r/>
+            <w:r>
+              <w:rPr>
+                <w:b w:val="0"/>
+                <w:i w:val="0"/>
+                <w:sz w:val="14"/>
+              </w:rPr>
+            </w:r>
+          </w:p>
+        </w:tc>
+      </w:tr>
+      <w:tr>
+        <w:tc>
+          <w:tcPr>
+            <w:tcW w:type="dxa" w:w="850"/>
+          </w:tcPr>
+          <w:p>
+            <w:r/>
+            <w:r>
+              <w:rPr>
+                <w:b/>
+                <w:i w:val="0"/>
+                <w:sz w:val="16"/>
+              </w:rPr>
+              <w:t>s.101</w:t>
+            </w:r>
+          </w:p>
+        </w:tc>
+        <w:tc>
+          <w:tcPr>
+            <w:tcW w:type="dxa" w:w="2268"/>
+          </w:tcPr>
+          <w:p>
+            <w:r/>
+            <w:r>
+              <w:rPr>
+                <w:b w:val="0"/>
+                <w:i/>
+                <w:color w:val="555555"/>
+                <w:sz w:val="14"/>
+              </w:rPr>
+              <w:t>appeals against an order of the Board or the Committee (J14)</w:t>
+            </w:r>
+          </w:p>
+        </w:tc>
+        <w:tc>
+          <w:tcPr>
+            <w:tcW w:type="dxa" w:w="8787"/>
+          </w:tcPr>
+          <w:p>
+            <w:r/>
+            <w:r>
+              <w:rPr>
+                <w:b w:val="0"/>
+                <w:i w:val="0"/>
+                <w:sz w:val="14"/>
+              </w:rPr>
+              <w:t>101. Appeals.</w:t>
+              <w:br/>
+              <w:t>(1) Subject to the provisions of this Act, any person aggrieved by an order made by the Committee or the Board under this Act may, within thirty days from the date of such order, prefer an appeal to the Children's Court, except for decisions by the Committee related to Foster Care and Sponsorship After Care for which the appeal shall lie with the District Magistrate:</w:t>
+              <w:br/>
+              <w:t>Provided that the Court of Sessions, or the District Magistrate, as the case may be, may entertain the appeal after the expiry of the said period of thirty days, if it is satisfied that the appellant was prevented by sufficient cause from filing the appeal in time and such appeal shall be decided within a period of thirty days.</w:t>
+              <w:br/>
+              <w:t>(2) An appeal shall lie against an order of the Board passed after making the preliminary assessment into a heinous offence under section 15 of the Act, before the Court of Sessions and the Court may, while deciding the appeal, take the assistance of experienced psychologists and medical specialists other than those whose assistance has been obtained by the Board in passing the order under the said section.</w:t>
+              <w:br/>
+              <w:t>[(3) No appeal shall lie from any order of acquittal made by the Board in respect of a child alleged to have committed an offence other than the heinous offence by a child who has completed or is above the age of sixteen years.]</w:t>
+              <w:br/>
+              <w:t>(4) No second appeal shall lie from any order of the Court of Session, passed in appeal under this section.</w:t>
+              <w:br/>
+              <w:t>(5) Any person aggrieved by an order of the Children's Court may file an appeal before the High Court in accordance with the procedure specified in the Code of Criminal Procedure, 1973 (2 of 1974).</w:t>
+              <w:br/>
+              <w:t>[(6) Any person aggrieved by an adoption order passed by the District Magistrate may, within a period of thirty days from the date of such order passed by the District Magistrate, file an appeal before the Divisional Commissioner.</w:t>
+              <w:br/>
+              <w:t>(7) Every appeal filed under sub-section (6), shall be decided as expeditiously as possible and an endeavour shall be made to dispose it within a period of four weeks from the date of filing of the appeal:</w:t>
+              <w:br/>
+              <w:t>Provided that where there is no Divisional Commissioner, the State Government or Union territory Administration, as the case may be, may, by notification, empower an officer equivalent to the rank of the Divisional Commissioner to decide the appeal.]</w:t>
+            </w:r>
+          </w:p>
+          <w:p>
+            <w:r>
+              <w:rPr>
+                <w:i/>
+                <w:color w:val="555555"/>
+                <w:sz w:val="13"/>
+              </w:rPr>
+              <w:t>Amendment notes India Code prints: 1. Subs. by Act 23 of 2021, s. 28, for sub-section (3) (w.e.f. 1-9-2022). 2. Ins. by s. 28, ibid. (w.e.f. 1-9-2022).</w:t>
+            </w:r>
+          </w:p>
+        </w:tc>
+        <w:tc>
+          <w:tcPr>
+            <w:tcW w:type="dxa" w:w="2948"/>
+          </w:tcPr>
+          <w:p>
+            <w:r/>
+            <w:r>
+              <w:rPr>
+                <w:b w:val="0"/>
+                <w:i w:val="0"/>
+                <w:sz w:val="14"/>
+              </w:rPr>
+            </w:r>
+          </w:p>
+        </w:tc>
+      </w:tr>
+    </w:tbl>
+    <w:p>
+      <w:r>
+        <w:rPr>
+          <w:i/>
+          <w:color w:val="555555"/>
+          <w:sz w:val="16"/>
+        </w:rPr>
+        <w:t>Corrections made against India Code's PDF in the sections above (the text in the table is the corrected text). (1) s.2: the database read "childs"; the PDF reads "child's". Why: India Code's database drops the possessive apostrophe; the PDF reads “child's”. (2) s.2: the database read "childrens"; the PDF reads "children's". Why: India Code's database drops the possessive apostrophe; the PDF reads “children's”. (3) s.2: the database read "Childrens"; the PDF reads "Children's". Why: India Code's database drops the possessive apostrophe in the defined terms “Children's Court” and “Children's Home”; the PDF has it. (4) s.3: the database read "childs"; the PDF reads "child's". Why: India Code's database drops the possessive apostrophe; the PDF reads “child's”. (5) s.8: the database read "childs"; the PDF reads "child's". Why: India Code's database drops the possessive apostrophe; the PDF reads “child's”. (6) s.8: the database read "Childrens"; the PDF reads "Children's". Why: India Code's database drops the possessive apostrophe in the defined terms “Children's Court” and “Children's Home”; the PDF has it. (7) s.2: the database read "a [has been or is being or is likely to be] for carrying out"; the PDF reads "a [child care institution], for carrying out". Why: India Code's database corrupted the definition of “Child Welfare Officer” (clause 17): the amendment-inserted defined term in the brackets was overwritten by a fragment (“has been or is being or is likely to be”) copied from clause (viii) of the definition of “child in need of care and protection”. The PDF's clause (17) reads “an officer attached to a [child care institution], for carrying out the directions”. Corrected against the PDF. (8) s.2: the database read "Childrens Home"; the PDF reads "Children's Home". Why: India Code's database drops the possessive apostrophe in this amendment footnote; the PDF reads “Children's Home”. (9) s.12: the database read "the persons release"; the PDF reads "the person's release". Why: India Code's database drops the possessive apostrophe; the PDF reads “the person's release”.</w:t>
+      </w:r>
+    </w:p>
+    <w:p>
+      <w:pPr>
+        <w:pStyle w:val="Heading2"/>
+      </w:pPr>
+      <w:r>
         <w:t>Wording: what the site will show</w:t>
       </w:r>
     </w:p>
@@ -6649,7 +9077,7 @@
     </w:p>
     <w:p>
       <w:r>
-        <w:t>The check is a comparison of two texts that India Code publishes: its database and its PDF of the same Act. It cannot find an error that both share, and it cannot tell whether either is the law today. Run on the first five Acts it compared about 54,000 words and found nine places where the database was wrong (two doubled words, two lost apostrophes, a lost proviso, a misplaced phrase, three headings), which the loader now corrects against the PDF. Run on the two short Acts added afterwards (1,212 words) it found one more defect, in two clauses: the piece of clause (a) copied into clauses (b) and (c) of section 7 of the Muslim Women Act (see the note under that Act's table), also corrected against the PDF; in the Public Property Act it found only the one spelling slip noted under its table. Everything else it found is listed in the loader's manifest next to what the PDF reads.</w:t>
+        <w:t>The check is a comparison of two texts that India Code publishes: its database and its PDF of the same Act. It cannot find an error that both share, and it cannot tell whether either is the law today. Run on the first five Acts it compared about 54,000 words and found nine places where the database was wrong (two doubled words, two lost apostrophes, a lost proviso, a misplaced phrase, three headings), which the loader now corrects against the PDF. Run on the two short Acts added afterwards (1,212 words) it found one more defect, in two clauses: the piece of clause (a) copied into clauses (b) and (c) of section 7 of the Muslim Women Act (see the note under that Act's table), also corrected against the PDF; in the Public Property Act it found only the one spelling slip noted under its table. Run on the Dowry Prohibition Act and the Juvenile Justice Act (27,981 words) it found: in the Juvenile Justice Act the "Child Welfare Officer" definition garbled (corrected, see the note under its table) and the possessive apostrophe dropped throughout (child's, children's, person's, parent's) with a few hyphens, 30 corrections against the PDF in all; the Dowry Act's section 8A is in the PDF body but missing from the PDF's printed list of sections (an amendment-inserted section the index was not updated for), which the loader is told to expect while still checking the section's text against the PDF. Everything else it found is listed in the loader's manifest next to what the PDF reads.</w:t>
       </w:r>
     </w:p>
     <w:p>

</xml_diff>